<commit_message>
feat: Added first prototype:
Features the following:
-Divided each key functionality into services
-Added third_party folder that has all the third party libraries that aren't generated from STM32CubeMX and instead integrated by me
-Architecture supports easy integration testing by adding more applications dedicated to that.

Can be more modularized by creating a BSP, that's on TODO list.

Created as well initial documentation, will be tweaked later.
</commit_message>
<xml_diff>
--- a/methodology/metodologia.docx
+++ b/methodology/metodologia.docx
@@ -24,7 +24,7 @@
       <w:pPr>
         <w:pStyle w:val="ListParagraph"/>
         <w:numPr>
-          <w:ilvl w:val="0"/>
+          <w:ilvl w:val="1"/>
           <w:numId w:val="1"/>
         </w:numPr>
         <w:rPr>
@@ -35,13 +35,554 @@
         <w:rPr>
           <w:lang w:val="es-MX"/>
         </w:rPr>
-        <w:t xml:space="preserve">Seleccionar protocolo de comunicación para el </w:t>
-      </w:r>
-      <w:r>
-        <w:rPr>
-          <w:lang w:val="es-MX"/>
-        </w:rPr>
-        <w:t>lis2du12</w:t>
+        <w:t xml:space="preserve">2 familias de STM32 con consumo </w:t>
+      </w:r>
+      <w:proofErr w:type="spellStart"/>
+      <w:r>
+        <w:rPr>
+          <w:lang w:val="es-MX"/>
+        </w:rPr>
+        <w:t>ultrabajo</w:t>
+      </w:r>
+      <w:proofErr w:type="spellEnd"/>
+      <w:r>
+        <w:rPr>
+          <w:lang w:val="es-MX"/>
+        </w:rPr>
+        <w:t>, U5 y L4, del U5 ya he trabajado con el U575, con este perfil bajo STOP3</w:t>
+      </w:r>
+    </w:p>
+    <w:p>
+      <w:pPr>
+        <w:rPr>
+          <w:lang w:val="es-MX"/>
+        </w:rPr>
+      </w:pPr>
+      <w:r>
+        <w:rPr>
+          <w:lang w:val="es-MX"/>
+        </w:rPr>
+        <w:t xml:space="preserve">En STOP3 </w:t>
+      </w:r>
+      <w:proofErr w:type="spellStart"/>
+      <w:r>
+        <w:rPr>
+          <w:lang w:val="es-MX"/>
+        </w:rPr>
+        <w:t>mode</w:t>
+      </w:r>
+      <w:proofErr w:type="spellEnd"/>
+    </w:p>
+    <w:p>
+      <w:pPr>
+        <w:ind w:left="1080"/>
+        <w:rPr>
+          <w:lang w:val="es-MX"/>
+        </w:rPr>
+      </w:pPr>
+      <w:r>
+        <w:rPr>
+          <w:noProof/>
+          <w:lang w:val="es-MX"/>
+        </w:rPr>
+        <w:drawing>
+          <wp:inline distT="0" distB="0" distL="0" distR="0" wp14:anchorId="312D6A8E" wp14:editId="77A11A8E">
+            <wp:extent cx="5943600" cy="3921125"/>
+            <wp:effectExtent l="0" t="0" r="0" b="3175"/>
+            <wp:docPr id="935239595" name="Picture 1"/>
+            <wp:cNvGraphicFramePr>
+              <a:graphicFrameLocks xmlns:a="http://schemas.openxmlformats.org/drawingml/2006/main" noChangeAspect="1"/>
+            </wp:cNvGraphicFramePr>
+            <a:graphic xmlns:a="http://schemas.openxmlformats.org/drawingml/2006/main">
+              <a:graphicData uri="http://schemas.openxmlformats.org/drawingml/2006/picture">
+                <pic:pic xmlns:pic="http://schemas.openxmlformats.org/drawingml/2006/picture">
+                  <pic:nvPicPr>
+                    <pic:cNvPr id="935239595" name=""/>
+                    <pic:cNvPicPr/>
+                  </pic:nvPicPr>
+                  <pic:blipFill>
+                    <a:blip r:embed="rId5"/>
+                    <a:stretch>
+                      <a:fillRect/>
+                    </a:stretch>
+                  </pic:blipFill>
+                  <pic:spPr>
+                    <a:xfrm>
+                      <a:off x="0" y="0"/>
+                      <a:ext cx="5943600" cy="3921125"/>
+                    </a:xfrm>
+                    <a:prstGeom prst="rect">
+                      <a:avLst/>
+                    </a:prstGeom>
+                  </pic:spPr>
+                </pic:pic>
+              </a:graphicData>
+            </a:graphic>
+          </wp:inline>
+        </w:drawing>
+      </w:r>
+    </w:p>
+    <w:p>
+      <w:pPr>
+        <w:pStyle w:val="ListParagraph"/>
+        <w:ind w:left="1440"/>
+        <w:rPr>
+          <w:lang w:val="es-MX"/>
+        </w:rPr>
+      </w:pPr>
+      <w:r>
+        <w:rPr>
+          <w:noProof/>
+          <w:lang w:val="es-MX"/>
+        </w:rPr>
+        <w:lastRenderedPageBreak/>
+        <w:drawing>
+          <wp:inline distT="0" distB="0" distL="0" distR="0" wp14:anchorId="195F81F6" wp14:editId="744DCC4A">
+            <wp:extent cx="5238631" cy="3590925"/>
+            <wp:effectExtent l="0" t="0" r="635" b="0"/>
+            <wp:docPr id="2094255037" name="Picture 1"/>
+            <wp:cNvGraphicFramePr>
+              <a:graphicFrameLocks xmlns:a="http://schemas.openxmlformats.org/drawingml/2006/main" noChangeAspect="1"/>
+            </wp:cNvGraphicFramePr>
+            <a:graphic xmlns:a="http://schemas.openxmlformats.org/drawingml/2006/main">
+              <a:graphicData uri="http://schemas.openxmlformats.org/drawingml/2006/picture">
+                <pic:pic xmlns:pic="http://schemas.openxmlformats.org/drawingml/2006/picture">
+                  <pic:nvPicPr>
+                    <pic:cNvPr id="2094255037" name=""/>
+                    <pic:cNvPicPr/>
+                  </pic:nvPicPr>
+                  <pic:blipFill>
+                    <a:blip r:embed="rId6"/>
+                    <a:stretch>
+                      <a:fillRect/>
+                    </a:stretch>
+                  </pic:blipFill>
+                  <pic:spPr>
+                    <a:xfrm>
+                      <a:off x="0" y="0"/>
+                      <a:ext cx="5250794" cy="3599263"/>
+                    </a:xfrm>
+                    <a:prstGeom prst="rect">
+                      <a:avLst/>
+                    </a:prstGeom>
+                  </pic:spPr>
+                </pic:pic>
+              </a:graphicData>
+            </a:graphic>
+          </wp:inline>
+        </w:drawing>
+      </w:r>
+    </w:p>
+    <w:p>
+      <w:pPr>
+        <w:pStyle w:val="ListParagraph"/>
+        <w:ind w:left="1440"/>
+        <w:rPr>
+          <w:lang w:val="es-MX"/>
+        </w:rPr>
+      </w:pPr>
+      <w:r>
+        <w:rPr>
+          <w:lang w:val="es-MX"/>
+        </w:rPr>
+        <w:t>El U545 tiene el siguiente perfil:</w:t>
+      </w:r>
+    </w:p>
+    <w:p>
+      <w:pPr>
+        <w:pStyle w:val="ListParagraph"/>
+        <w:ind w:left="1440"/>
+        <w:rPr>
+          <w:lang w:val="es-MX"/>
+        </w:rPr>
+      </w:pPr>
+      <w:r>
+        <w:rPr>
+          <w:noProof/>
+          <w:lang w:val="es-MX"/>
+        </w:rPr>
+        <w:drawing>
+          <wp:inline distT="0" distB="0" distL="0" distR="0" wp14:anchorId="25A12A9A" wp14:editId="5D407F73">
+            <wp:extent cx="5600700" cy="2241477"/>
+            <wp:effectExtent l="0" t="0" r="0" b="6985"/>
+            <wp:docPr id="819982406" name="Picture 1"/>
+            <wp:cNvGraphicFramePr>
+              <a:graphicFrameLocks xmlns:a="http://schemas.openxmlformats.org/drawingml/2006/main" noChangeAspect="1"/>
+            </wp:cNvGraphicFramePr>
+            <a:graphic xmlns:a="http://schemas.openxmlformats.org/drawingml/2006/main">
+              <a:graphicData uri="http://schemas.openxmlformats.org/drawingml/2006/picture">
+                <pic:pic xmlns:pic="http://schemas.openxmlformats.org/drawingml/2006/picture">
+                  <pic:nvPicPr>
+                    <pic:cNvPr id="819982406" name=""/>
+                    <pic:cNvPicPr/>
+                  </pic:nvPicPr>
+                  <pic:blipFill>
+                    <a:blip r:embed="rId7"/>
+                    <a:stretch>
+                      <a:fillRect/>
+                    </a:stretch>
+                  </pic:blipFill>
+                  <pic:spPr>
+                    <a:xfrm>
+                      <a:off x="0" y="0"/>
+                      <a:ext cx="5613596" cy="2246638"/>
+                    </a:xfrm>
+                    <a:prstGeom prst="rect">
+                      <a:avLst/>
+                    </a:prstGeom>
+                  </pic:spPr>
+                </pic:pic>
+              </a:graphicData>
+            </a:graphic>
+          </wp:inline>
+        </w:drawing>
+      </w:r>
+    </w:p>
+    <w:p>
+      <w:pPr>
+        <w:pStyle w:val="ListParagraph"/>
+        <w:ind w:left="1440"/>
+        <w:rPr>
+          <w:lang w:val="es-MX"/>
+        </w:rPr>
+      </w:pPr>
+    </w:p>
+    <w:p>
+      <w:pPr>
+        <w:pStyle w:val="ListParagraph"/>
+        <w:ind w:left="1440"/>
+        <w:rPr>
+          <w:lang w:val="es-MX"/>
+        </w:rPr>
+      </w:pPr>
+      <w:r>
+        <w:rPr>
+          <w:noProof/>
+          <w:lang w:val="es-MX"/>
+        </w:rPr>
+        <w:lastRenderedPageBreak/>
+        <w:drawing>
+          <wp:inline distT="0" distB="0" distL="0" distR="0" wp14:anchorId="0B4326E7" wp14:editId="42F1D2F0">
+            <wp:extent cx="5876925" cy="3810583"/>
+            <wp:effectExtent l="0" t="0" r="0" b="0"/>
+            <wp:docPr id="1345908112" name="Picture 1"/>
+            <wp:cNvGraphicFramePr>
+              <a:graphicFrameLocks xmlns:a="http://schemas.openxmlformats.org/drawingml/2006/main" noChangeAspect="1"/>
+            </wp:cNvGraphicFramePr>
+            <a:graphic xmlns:a="http://schemas.openxmlformats.org/drawingml/2006/main">
+              <a:graphicData uri="http://schemas.openxmlformats.org/drawingml/2006/picture">
+                <pic:pic xmlns:pic="http://schemas.openxmlformats.org/drawingml/2006/picture">
+                  <pic:nvPicPr>
+                    <pic:cNvPr id="1345908112" name=""/>
+                    <pic:cNvPicPr/>
+                  </pic:nvPicPr>
+                  <pic:blipFill>
+                    <a:blip r:embed="rId8"/>
+                    <a:stretch>
+                      <a:fillRect/>
+                    </a:stretch>
+                  </pic:blipFill>
+                  <pic:spPr>
+                    <a:xfrm>
+                      <a:off x="0" y="0"/>
+                      <a:ext cx="5882120" cy="3813952"/>
+                    </a:xfrm>
+                    <a:prstGeom prst="rect">
+                      <a:avLst/>
+                    </a:prstGeom>
+                  </pic:spPr>
+                </pic:pic>
+              </a:graphicData>
+            </a:graphic>
+          </wp:inline>
+        </w:drawing>
+      </w:r>
+    </w:p>
+    <w:p>
+      <w:pPr>
+        <w:pStyle w:val="ListParagraph"/>
+        <w:ind w:left="1440"/>
+        <w:rPr>
+          <w:lang w:val="es-MX"/>
+        </w:rPr>
+      </w:pPr>
+      <w:r>
+        <w:rPr>
+          <w:lang w:val="es-MX"/>
+        </w:rPr>
+        <w:t xml:space="preserve">En STANDBY </w:t>
+      </w:r>
+      <w:proofErr w:type="spellStart"/>
+      <w:r>
+        <w:rPr>
+          <w:lang w:val="es-MX"/>
+        </w:rPr>
+        <w:t>Mode</w:t>
+      </w:r>
+      <w:proofErr w:type="spellEnd"/>
+      <w:r>
+        <w:rPr>
+          <w:lang w:val="es-MX"/>
+        </w:rPr>
+        <w:t>:</w:t>
+      </w:r>
+    </w:p>
+    <w:p>
+      <w:pPr>
+        <w:pStyle w:val="ListParagraph"/>
+        <w:ind w:left="1440"/>
+        <w:rPr>
+          <w:lang w:val="es-MX"/>
+        </w:rPr>
+      </w:pPr>
+      <w:r>
+        <w:rPr>
+          <w:lang w:val="es-MX"/>
+        </w:rPr>
+        <w:t>U575</w:t>
+      </w:r>
+    </w:p>
+    <w:p>
+      <w:pPr>
+        <w:pStyle w:val="ListParagraph"/>
+        <w:ind w:left="1440"/>
+        <w:rPr>
+          <w:lang w:val="es-MX"/>
+        </w:rPr>
+      </w:pPr>
+      <w:r>
+        <w:rPr>
+          <w:noProof/>
+          <w:lang w:val="es-MX"/>
+        </w:rPr>
+        <w:drawing>
+          <wp:inline distT="0" distB="0" distL="0" distR="0" wp14:anchorId="61189427" wp14:editId="0D6D1FC7">
+            <wp:extent cx="5476875" cy="3663538"/>
+            <wp:effectExtent l="0" t="0" r="0" b="0"/>
+            <wp:docPr id="768874735" name="Picture 1"/>
+            <wp:cNvGraphicFramePr>
+              <a:graphicFrameLocks xmlns:a="http://schemas.openxmlformats.org/drawingml/2006/main" noChangeAspect="1"/>
+            </wp:cNvGraphicFramePr>
+            <a:graphic xmlns:a="http://schemas.openxmlformats.org/drawingml/2006/main">
+              <a:graphicData uri="http://schemas.openxmlformats.org/drawingml/2006/picture">
+                <pic:pic xmlns:pic="http://schemas.openxmlformats.org/drawingml/2006/picture">
+                  <pic:nvPicPr>
+                    <pic:cNvPr id="768874735" name=""/>
+                    <pic:cNvPicPr/>
+                  </pic:nvPicPr>
+                  <pic:blipFill>
+                    <a:blip r:embed="rId9"/>
+                    <a:stretch>
+                      <a:fillRect/>
+                    </a:stretch>
+                  </pic:blipFill>
+                  <pic:spPr>
+                    <a:xfrm>
+                      <a:off x="0" y="0"/>
+                      <a:ext cx="5481861" cy="3666873"/>
+                    </a:xfrm>
+                    <a:prstGeom prst="rect">
+                      <a:avLst/>
+                    </a:prstGeom>
+                  </pic:spPr>
+                </pic:pic>
+              </a:graphicData>
+            </a:graphic>
+          </wp:inline>
+        </w:drawing>
+      </w:r>
+    </w:p>
+    <w:p>
+      <w:pPr>
+        <w:pStyle w:val="ListParagraph"/>
+        <w:ind w:left="1440"/>
+        <w:rPr>
+          <w:lang w:val="es-MX"/>
+        </w:rPr>
+      </w:pPr>
+    </w:p>
+    <w:p>
+      <w:pPr>
+        <w:pStyle w:val="ListParagraph"/>
+        <w:ind w:left="1440"/>
+        <w:rPr>
+          <w:lang w:val="es-MX"/>
+        </w:rPr>
+      </w:pPr>
+      <w:r>
+        <w:rPr>
+          <w:lang w:val="es-MX"/>
+        </w:rPr>
+        <w:lastRenderedPageBreak/>
+        <w:t>U545</w:t>
+      </w:r>
+    </w:p>
+    <w:p>
+      <w:pPr>
+        <w:pStyle w:val="ListParagraph"/>
+        <w:ind w:left="1440"/>
+        <w:rPr>
+          <w:lang w:val="es-MX"/>
+        </w:rPr>
+      </w:pPr>
+      <w:r>
+        <w:rPr>
+          <w:noProof/>
+          <w:lang w:val="es-MX"/>
+        </w:rPr>
+        <w:drawing>
+          <wp:inline distT="0" distB="0" distL="0" distR="0" wp14:anchorId="2C647105" wp14:editId="448C97E2">
+            <wp:extent cx="5943600" cy="4062730"/>
+            <wp:effectExtent l="0" t="0" r="0" b="0"/>
+            <wp:docPr id="1990798837" name="Picture 1"/>
+            <wp:cNvGraphicFramePr>
+              <a:graphicFrameLocks xmlns:a="http://schemas.openxmlformats.org/drawingml/2006/main" noChangeAspect="1"/>
+            </wp:cNvGraphicFramePr>
+            <a:graphic xmlns:a="http://schemas.openxmlformats.org/drawingml/2006/main">
+              <a:graphicData uri="http://schemas.openxmlformats.org/drawingml/2006/picture">
+                <pic:pic xmlns:pic="http://schemas.openxmlformats.org/drawingml/2006/picture">
+                  <pic:nvPicPr>
+                    <pic:cNvPr id="1990798837" name=""/>
+                    <pic:cNvPicPr/>
+                  </pic:nvPicPr>
+                  <pic:blipFill>
+                    <a:blip r:embed="rId10"/>
+                    <a:stretch>
+                      <a:fillRect/>
+                    </a:stretch>
+                  </pic:blipFill>
+                  <pic:spPr>
+                    <a:xfrm>
+                      <a:off x="0" y="0"/>
+                      <a:ext cx="5943600" cy="4062730"/>
+                    </a:xfrm>
+                    <a:prstGeom prst="rect">
+                      <a:avLst/>
+                    </a:prstGeom>
+                  </pic:spPr>
+                </pic:pic>
+              </a:graphicData>
+            </a:graphic>
+          </wp:inline>
+        </w:drawing>
+      </w:r>
+    </w:p>
+    <w:p>
+      <w:pPr>
+        <w:pStyle w:val="ListParagraph"/>
+        <w:ind w:left="1440"/>
+        <w:rPr>
+          <w:b/>
+          <w:bCs/>
+          <w:lang w:val="es-MX"/>
+        </w:rPr>
+      </w:pPr>
+      <w:r>
+        <w:rPr>
+          <w:b/>
+          <w:bCs/>
+          <w:lang w:val="es-MX"/>
+        </w:rPr>
+        <w:t>Elección:</w:t>
+      </w:r>
+    </w:p>
+    <w:p>
+      <w:pPr>
+        <w:pStyle w:val="ListParagraph"/>
+        <w:ind w:left="1440"/>
+        <w:rPr>
+          <w:lang w:val="es-MX"/>
+        </w:rPr>
+      </w:pPr>
+      <w:r>
+        <w:rPr>
+          <w:lang w:val="es-MX"/>
+        </w:rPr>
+        <w:t xml:space="preserve">Elegí irme por el U575 porque la diferencia entre ambos en STANDBY es </w:t>
+      </w:r>
+      <w:proofErr w:type="spellStart"/>
+      <w:r>
+        <w:rPr>
+          <w:lang w:val="es-MX"/>
+        </w:rPr>
+        <w:t>minsucula</w:t>
+      </w:r>
+      <w:proofErr w:type="spellEnd"/>
+      <w:r>
+        <w:rPr>
+          <w:lang w:val="es-MX"/>
+        </w:rPr>
+        <w:t xml:space="preserve"> (21 vs 20 </w:t>
+      </w:r>
+      <w:proofErr w:type="spellStart"/>
+      <w:r>
+        <w:rPr>
+          <w:lang w:val="es-MX"/>
+        </w:rPr>
+        <w:t>microamps</w:t>
+      </w:r>
+      <w:proofErr w:type="spellEnd"/>
+      <w:r>
+        <w:rPr>
+          <w:lang w:val="es-MX"/>
+        </w:rPr>
+        <w:t xml:space="preserve">) y tengo </w:t>
+      </w:r>
+      <w:proofErr w:type="gramStart"/>
+      <w:r>
+        <w:rPr>
+          <w:lang w:val="es-MX"/>
+        </w:rPr>
+        <w:t>una núcleo</w:t>
+      </w:r>
+      <w:proofErr w:type="gramEnd"/>
+      <w:r>
+        <w:rPr>
+          <w:lang w:val="es-MX"/>
+        </w:rPr>
+        <w:t xml:space="preserve"> del U575 para prototipado; El cambio entre esos 2 modelos es muy sencillo de hacer en el </w:t>
+      </w:r>
+      <w:proofErr w:type="spellStart"/>
+      <w:r>
+        <w:rPr>
+          <w:lang w:val="es-MX"/>
+        </w:rPr>
+        <w:t>CubeMX</w:t>
+      </w:r>
+      <w:proofErr w:type="spellEnd"/>
+      <w:r>
+        <w:rPr>
+          <w:lang w:val="es-MX"/>
+        </w:rPr>
+        <w:t xml:space="preserve"> o con una macro que incluya el </w:t>
+      </w:r>
+      <w:proofErr w:type="spellStart"/>
+      <w:r>
+        <w:rPr>
+          <w:lang w:val="es-MX"/>
+        </w:rPr>
+        <w:t>hal</w:t>
+      </w:r>
+      <w:proofErr w:type="spellEnd"/>
+      <w:r>
+        <w:rPr>
+          <w:lang w:val="es-MX"/>
+        </w:rPr>
+        <w:t xml:space="preserve"> de uno u otro, </w:t>
+      </w:r>
+      <w:proofErr w:type="spellStart"/>
+      <w:r>
+        <w:rPr>
+          <w:lang w:val="es-MX"/>
+        </w:rPr>
+        <w:t>asi</w:t>
+      </w:r>
+      <w:proofErr w:type="spellEnd"/>
+      <w:r>
+        <w:rPr>
+          <w:lang w:val="es-MX"/>
+        </w:rPr>
+        <w:t xml:space="preserve"> que aquí me voy por la opción más fácil de testear.</w:t>
       </w:r>
     </w:p>
     <w:p>
@@ -55,138 +596,6 @@
           <w:lang w:val="es-MX"/>
         </w:rPr>
       </w:pPr>
-      <w:r>
-        <w:rPr>
-          <w:lang w:val="es-MX"/>
-        </w:rPr>
-        <w:t xml:space="preserve">Seleccionar SPI porque </w:t>
-      </w:r>
-      <w:r>
-        <w:rPr>
-          <w:lang w:val="es-MX"/>
-        </w:rPr>
-        <w:t xml:space="preserve">al no ocupar líneas </w:t>
-      </w:r>
-      <w:proofErr w:type="spellStart"/>
-      <w:r>
-        <w:rPr>
-          <w:lang w:val="es-MX"/>
-        </w:rPr>
-        <w:t>pull</w:t>
-      </w:r>
-      <w:proofErr w:type="spellEnd"/>
-      <w:r>
-        <w:rPr>
-          <w:lang w:val="es-MX"/>
-        </w:rPr>
-        <w:t xml:space="preserve">-up no hay </w:t>
-      </w:r>
-      <w:proofErr w:type="spellStart"/>
-      <w:r>
-        <w:rPr>
-          <w:lang w:val="es-MX"/>
-        </w:rPr>
-        <w:t>leakage</w:t>
-      </w:r>
-      <w:proofErr w:type="spellEnd"/>
-      <w:r>
-        <w:rPr>
-          <w:lang w:val="es-MX"/>
-        </w:rPr>
-        <w:t xml:space="preserve"> </w:t>
-      </w:r>
-      <w:proofErr w:type="spellStart"/>
-      <w:r>
-        <w:rPr>
-          <w:lang w:val="es-MX"/>
-        </w:rPr>
-        <w:t>current</w:t>
-      </w:r>
-      <w:proofErr w:type="spellEnd"/>
-      <w:r>
-        <w:rPr>
-          <w:lang w:val="es-MX"/>
-        </w:rPr>
-        <w:t xml:space="preserve"> (menor consumo de energía), las transmisiones son determinísticas, </w:t>
-      </w:r>
-      <w:r>
-        <w:rPr>
-          <w:lang w:val="es-MX"/>
-        </w:rPr>
-        <w:t xml:space="preserve">solo hay un </w:t>
-      </w:r>
-      <w:proofErr w:type="spellStart"/>
-      <w:r>
-        <w:rPr>
-          <w:lang w:val="es-MX"/>
-        </w:rPr>
-        <w:t>periferico</w:t>
-      </w:r>
-      <w:proofErr w:type="spellEnd"/>
-      <w:r>
-        <w:rPr>
-          <w:lang w:val="es-MX"/>
-        </w:rPr>
-        <w:t xml:space="preserve">, </w:t>
-      </w:r>
-      <w:r>
-        <w:rPr>
-          <w:lang w:val="es-MX"/>
-        </w:rPr>
-        <w:t xml:space="preserve">y </w:t>
-      </w:r>
-      <w:r>
-        <w:rPr>
-          <w:lang w:val="es-MX"/>
-        </w:rPr>
-        <w:t xml:space="preserve">el </w:t>
-      </w:r>
-      <w:proofErr w:type="spellStart"/>
-      <w:r>
-        <w:rPr>
-          <w:lang w:val="es-MX"/>
-        </w:rPr>
-        <w:t>numero</w:t>
-      </w:r>
-      <w:proofErr w:type="spellEnd"/>
-      <w:r>
-        <w:rPr>
-          <w:lang w:val="es-MX"/>
-        </w:rPr>
-        <w:t xml:space="preserve"> d</w:t>
-      </w:r>
-      <w:r>
-        <w:rPr>
-          <w:lang w:val="es-MX"/>
-        </w:rPr>
-        <w:t>e pines adicional</w:t>
-      </w:r>
-      <w:r>
-        <w:rPr>
-          <w:lang w:val="es-MX"/>
-        </w:rPr>
-        <w:t>es</w:t>
-      </w:r>
-      <w:r>
-        <w:rPr>
-          <w:lang w:val="es-MX"/>
-        </w:rPr>
-        <w:t xml:space="preserve"> no es un </w:t>
-      </w:r>
-      <w:proofErr w:type="spellStart"/>
-      <w:r>
-        <w:rPr>
-          <w:lang w:val="es-MX"/>
-        </w:rPr>
-        <w:t>contraint</w:t>
-      </w:r>
-      <w:proofErr w:type="spellEnd"/>
-      <w:r>
-        <w:rPr>
-          <w:lang w:val="es-MX"/>
-        </w:rPr>
-        <w:t xml:space="preserve">. </w:t>
-      </w:r>
     </w:p>
     <w:p>
       <w:pPr>
@@ -195,26 +604,177 @@
           <w:ilvl w:val="0"/>
           <w:numId w:val="1"/>
         </w:numPr>
-      </w:pPr>
-      <w:r>
-        <w:rPr>
-          <w:lang w:val="es-MX"/>
-        </w:rPr>
-        <w:t xml:space="preserve">Investigar, </w:t>
-      </w:r>
-      <w:proofErr w:type="gramStart"/>
-      <w:r>
-        <w:rPr>
-          <w:lang w:val="es-MX"/>
-        </w:rPr>
-        <w:t>empezando checando</w:t>
-      </w:r>
-      <w:proofErr w:type="gramEnd"/>
-      <w:r>
-        <w:rPr>
-          <w:lang w:val="es-MX"/>
-        </w:rPr>
-        <w:t xml:space="preserve"> los recursos del fabricante (STM) si existen ya librerías genéricas para </w:t>
+        <w:rPr>
+          <w:lang w:val="es-MX"/>
+        </w:rPr>
+      </w:pPr>
+      <w:r>
+        <w:rPr>
+          <w:lang w:val="es-MX"/>
+        </w:rPr>
+        <w:t xml:space="preserve">Seleccionar protocolo de comunicación para el </w:t>
+      </w:r>
+      <w:r>
+        <w:t>LIS2DW12 </w:t>
+      </w:r>
+    </w:p>
+    <w:p>
+      <w:pPr>
+        <w:pStyle w:val="ListParagraph"/>
+        <w:numPr>
+          <w:ilvl w:val="1"/>
+          <w:numId w:val="1"/>
+        </w:numPr>
+        <w:rPr>
+          <w:lang w:val="es-MX"/>
+        </w:rPr>
+      </w:pPr>
+      <w:r>
+        <w:rPr>
+          <w:lang w:val="es-MX"/>
+        </w:rPr>
+        <w:t xml:space="preserve">Seleccionar SPI porque </w:t>
+      </w:r>
+      <w:r>
+        <w:rPr>
+          <w:lang w:val="es-MX"/>
+        </w:rPr>
+        <w:t xml:space="preserve">al no ocupar líneas </w:t>
+      </w:r>
+      <w:proofErr w:type="spellStart"/>
+      <w:r>
+        <w:rPr>
+          <w:lang w:val="es-MX"/>
+        </w:rPr>
+        <w:t>pull</w:t>
+      </w:r>
+      <w:proofErr w:type="spellEnd"/>
+      <w:r>
+        <w:rPr>
+          <w:lang w:val="es-MX"/>
+        </w:rPr>
+        <w:t xml:space="preserve">-up no hay </w:t>
+      </w:r>
+      <w:proofErr w:type="spellStart"/>
+      <w:r>
+        <w:rPr>
+          <w:lang w:val="es-MX"/>
+        </w:rPr>
+        <w:t>leakage</w:t>
+      </w:r>
+      <w:proofErr w:type="spellEnd"/>
+      <w:r>
+        <w:rPr>
+          <w:lang w:val="es-MX"/>
+        </w:rPr>
+        <w:t xml:space="preserve"> </w:t>
+      </w:r>
+      <w:proofErr w:type="spellStart"/>
+      <w:r>
+        <w:rPr>
+          <w:lang w:val="es-MX"/>
+        </w:rPr>
+        <w:t>current</w:t>
+      </w:r>
+      <w:proofErr w:type="spellEnd"/>
+      <w:r>
+        <w:rPr>
+          <w:lang w:val="es-MX"/>
+        </w:rPr>
+        <w:t xml:space="preserve"> (menor consumo de energía), las transmisiones son determinísticas, </w:t>
+      </w:r>
+      <w:r>
+        <w:rPr>
+          <w:lang w:val="es-MX"/>
+        </w:rPr>
+        <w:t xml:space="preserve">solo hay un </w:t>
+      </w:r>
+      <w:proofErr w:type="spellStart"/>
+      <w:r>
+        <w:rPr>
+          <w:lang w:val="es-MX"/>
+        </w:rPr>
+        <w:t>periferico</w:t>
+      </w:r>
+      <w:proofErr w:type="spellEnd"/>
+      <w:r>
+        <w:rPr>
+          <w:lang w:val="es-MX"/>
+        </w:rPr>
+        <w:t xml:space="preserve">, </w:t>
+      </w:r>
+      <w:r>
+        <w:rPr>
+          <w:lang w:val="es-MX"/>
+        </w:rPr>
+        <w:t xml:space="preserve">y </w:t>
+      </w:r>
+      <w:r>
+        <w:rPr>
+          <w:lang w:val="es-MX"/>
+        </w:rPr>
+        <w:t xml:space="preserve">el </w:t>
+      </w:r>
+      <w:proofErr w:type="spellStart"/>
+      <w:r>
+        <w:rPr>
+          <w:lang w:val="es-MX"/>
+        </w:rPr>
+        <w:t>numero</w:t>
+      </w:r>
+      <w:proofErr w:type="spellEnd"/>
+      <w:r>
+        <w:rPr>
+          <w:lang w:val="es-MX"/>
+        </w:rPr>
+        <w:t xml:space="preserve"> d</w:t>
+      </w:r>
+      <w:r>
+        <w:rPr>
+          <w:lang w:val="es-MX"/>
+        </w:rPr>
+        <w:t>e pines adicional</w:t>
+      </w:r>
+      <w:r>
+        <w:rPr>
+          <w:lang w:val="es-MX"/>
+        </w:rPr>
+        <w:t>es</w:t>
+      </w:r>
+      <w:r>
+        <w:rPr>
+          <w:lang w:val="es-MX"/>
+        </w:rPr>
+        <w:t xml:space="preserve"> no es un </w:t>
+      </w:r>
+      <w:proofErr w:type="spellStart"/>
+      <w:r>
+        <w:rPr>
+          <w:lang w:val="es-MX"/>
+        </w:rPr>
+        <w:t>contraint</w:t>
+      </w:r>
+      <w:proofErr w:type="spellEnd"/>
+      <w:r>
+        <w:rPr>
+          <w:lang w:val="es-MX"/>
+        </w:rPr>
+        <w:t xml:space="preserve">. </w:t>
+      </w:r>
+    </w:p>
+    <w:p>
+      <w:pPr>
+        <w:pStyle w:val="ListParagraph"/>
+        <w:numPr>
+          <w:ilvl w:val="0"/>
+          <w:numId w:val="1"/>
+        </w:numPr>
+      </w:pPr>
+      <w:r>
+        <w:rPr>
+          <w:lang w:val="es-MX"/>
+        </w:rPr>
+        <w:t xml:space="preserve">Investigar, empezando checando los recursos del fabricante (STM) si existen ya librerías genéricas para </w:t>
       </w:r>
       <w:r>
         <w:rPr>
@@ -269,7 +829,7 @@
       <w:r>
         <w:t xml:space="preserve"> official: </w:t>
       </w:r>
-      <w:hyperlink r:id="rId5" w:history="1">
+      <w:hyperlink r:id="rId11" w:history="1">
         <w:r>
           <w:rPr>
             <w:rStyle w:val="Hyperlink"/>
@@ -324,6 +884,26 @@
         </w:rPr>
         <w:t xml:space="preserve"> </w:t>
       </w:r>
+      <w:r>
+        <w:rPr>
+          <w:lang w:val="es-MX"/>
+        </w:rPr>
+        <w:t xml:space="preserve">repo (que usaremos como </w:t>
+      </w:r>
+      <w:proofErr w:type="spellStart"/>
+      <w:r>
+        <w:rPr>
+          <w:lang w:val="es-MX"/>
+        </w:rPr>
+        <w:t>git</w:t>
+      </w:r>
+      <w:proofErr w:type="spellEnd"/>
+      <w:r>
+        <w:rPr>
+          <w:lang w:val="es-MX"/>
+        </w:rPr>
+        <w:t xml:space="preserve"> </w:t>
+      </w:r>
       <w:proofErr w:type="spellStart"/>
       <w:r>
         <w:rPr>
@@ -336,16 +916,17 @@
         <w:rPr>
           <w:lang w:val="es-MX"/>
         </w:rPr>
+        <w:t>)</w:t>
+      </w:r>
+      <w:r>
+        <w:rPr>
+          <w:lang w:val="es-MX"/>
+        </w:rPr>
         <w:t>:</w:t>
       </w:r>
     </w:p>
     <w:p>
-      <w:pPr>
-        <w:rPr>
-          <w:lang w:val="es-MX"/>
-        </w:rPr>
-      </w:pPr>
-      <w:hyperlink r:id="rId6" w:history="1">
+      <w:hyperlink r:id="rId12" w:history="1">
         <w:r>
           <w:rPr>
             <w:rStyle w:val="Hyperlink"/>
@@ -355,12 +936,1445 @@
       </w:hyperlink>
     </w:p>
     <w:p>
-      <w:pPr>
-        <w:pStyle w:val="ListParagraph"/>
-        <w:numPr>
-          <w:ilvl w:val="0"/>
-          <w:numId w:val="1"/>
-        </w:numPr>
+      <w:r>
+        <w:t xml:space="preserve">Y </w:t>
+      </w:r>
+      <w:proofErr w:type="spellStart"/>
+      <w:r>
+        <w:t>este</w:t>
+      </w:r>
+      <w:proofErr w:type="spellEnd"/>
+    </w:p>
+    <w:p>
+      <w:pPr>
+        <w:rPr>
+          <w:lang w:val="es-MX"/>
+        </w:rPr>
+      </w:pPr>
+      <w:hyperlink r:id="rId13" w:history="1">
+        <w:r>
+          <w:rPr>
+            <w:rStyle w:val="Hyperlink"/>
+            <w:lang w:val="es-MX"/>
+          </w:rPr>
+          <w:t>https://github.com/STMicroelectronics/lis2dw12-pid/tree/master</w:t>
+        </w:r>
+      </w:hyperlink>
+    </w:p>
+    <w:p>
+      <w:pPr>
+        <w:rPr>
+          <w:lang w:val="es-MX"/>
+        </w:rPr>
+      </w:pPr>
+    </w:p>
+    <w:p>
+      <w:pPr>
+        <w:rPr>
+          <w:lang w:val="es-MX"/>
+        </w:rPr>
+      </w:pPr>
+    </w:p>
+    <w:p>
+      <w:pPr>
+        <w:rPr>
+          <w:lang w:val="es-MX"/>
+        </w:rPr>
+      </w:pPr>
+      <w:r>
+        <w:rPr>
+          <w:lang w:val="es-MX"/>
+        </w:rPr>
+        <w:t xml:space="preserve">Configurando el </w:t>
+      </w:r>
+      <w:proofErr w:type="spellStart"/>
+      <w:r>
+        <w:rPr>
+          <w:lang w:val="es-MX"/>
+        </w:rPr>
+        <w:t>periferico</w:t>
+      </w:r>
+      <w:proofErr w:type="spellEnd"/>
+      <w:r>
+        <w:rPr>
+          <w:lang w:val="es-MX"/>
+        </w:rPr>
+        <w:t xml:space="preserve"> SPI en STM:</w:t>
+      </w:r>
+    </w:p>
+    <w:p>
+      <w:pPr>
+        <w:rPr>
+          <w:lang w:val="es-MX"/>
+        </w:rPr>
+      </w:pPr>
+      <w:proofErr w:type="spellStart"/>
+      <w:r>
+        <w:rPr>
+          <w:lang w:val="es-MX"/>
+        </w:rPr>
+        <w:t>Basandonos</w:t>
+      </w:r>
+      <w:proofErr w:type="spellEnd"/>
+      <w:r>
+        <w:rPr>
+          <w:lang w:val="es-MX"/>
+        </w:rPr>
+        <w:t xml:space="preserve"> en la datasheet del lis2dw12:</w:t>
+      </w:r>
+    </w:p>
+    <w:p>
+      <w:pPr>
+        <w:rPr>
+          <w:lang w:val="es-MX"/>
+        </w:rPr>
+      </w:pPr>
+      <w:r>
+        <w:rPr>
+          <w:noProof/>
+          <w:lang w:val="es-MX"/>
+        </w:rPr>
+        <w:drawing>
+          <wp:inline distT="0" distB="0" distL="0" distR="0" wp14:anchorId="4E43AA6B" wp14:editId="44DFC13E">
+            <wp:extent cx="5943600" cy="5358130"/>
+            <wp:effectExtent l="0" t="0" r="0" b="0"/>
+            <wp:docPr id="1095564845" name="Picture 1"/>
+            <wp:cNvGraphicFramePr>
+              <a:graphicFrameLocks xmlns:a="http://schemas.openxmlformats.org/drawingml/2006/main" noChangeAspect="1"/>
+            </wp:cNvGraphicFramePr>
+            <a:graphic xmlns:a="http://schemas.openxmlformats.org/drawingml/2006/main">
+              <a:graphicData uri="http://schemas.openxmlformats.org/drawingml/2006/picture">
+                <pic:pic xmlns:pic="http://schemas.openxmlformats.org/drawingml/2006/picture">
+                  <pic:nvPicPr>
+                    <pic:cNvPr id="1095564845" name=""/>
+                    <pic:cNvPicPr/>
+                  </pic:nvPicPr>
+                  <pic:blipFill>
+                    <a:blip r:embed="rId14"/>
+                    <a:stretch>
+                      <a:fillRect/>
+                    </a:stretch>
+                  </pic:blipFill>
+                  <pic:spPr>
+                    <a:xfrm>
+                      <a:off x="0" y="0"/>
+                      <a:ext cx="5943600" cy="5358130"/>
+                    </a:xfrm>
+                    <a:prstGeom prst="rect">
+                      <a:avLst/>
+                    </a:prstGeom>
+                  </pic:spPr>
+                </pic:pic>
+              </a:graphicData>
+            </a:graphic>
+          </wp:inline>
+        </w:drawing>
+      </w:r>
+    </w:p>
+    <w:p>
+      <w:pPr>
+        <w:rPr>
+          <w:lang w:val="es-MX"/>
+        </w:rPr>
+      </w:pPr>
+      <w:r>
+        <w:rPr>
+          <w:lang w:val="es-MX"/>
+        </w:rPr>
+        <w:t xml:space="preserve">Aquí obtenemos la velocidad máxima del </w:t>
+      </w:r>
+      <w:proofErr w:type="spellStart"/>
+      <w:r>
+        <w:rPr>
+          <w:lang w:val="es-MX"/>
+        </w:rPr>
+        <w:t>clock</w:t>
+      </w:r>
+      <w:proofErr w:type="spellEnd"/>
+      <w:r>
+        <w:rPr>
+          <w:lang w:val="es-MX"/>
+        </w:rPr>
+        <w:t>, que sería 10MHz</w:t>
+      </w:r>
+      <w:r>
+        <w:rPr>
+          <w:lang w:val="es-MX"/>
+        </w:rPr>
+        <w:t xml:space="preserve">, así como el </w:t>
+      </w:r>
+      <w:proofErr w:type="spellStart"/>
+      <w:r>
+        <w:rPr>
+          <w:lang w:val="es-MX"/>
+        </w:rPr>
+        <w:t>setup</w:t>
+      </w:r>
+      <w:proofErr w:type="spellEnd"/>
+      <w:r>
+        <w:rPr>
+          <w:lang w:val="es-MX"/>
+        </w:rPr>
+        <w:t xml:space="preserve"> time del Chip </w:t>
+      </w:r>
+      <w:proofErr w:type="spellStart"/>
+      <w:r>
+        <w:rPr>
+          <w:lang w:val="es-MX"/>
+        </w:rPr>
+        <w:t>Select</w:t>
+      </w:r>
+      <w:proofErr w:type="spellEnd"/>
+      <w:r>
+        <w:rPr>
+          <w:lang w:val="es-MX"/>
+        </w:rPr>
+        <w:t>.</w:t>
+      </w:r>
+    </w:p>
+    <w:p>
+      <w:pPr>
+        <w:rPr>
+          <w:lang w:val="es-MX"/>
+        </w:rPr>
+      </w:pPr>
+    </w:p>
+    <w:p>
+      <w:pPr>
+        <w:rPr>
+          <w:lang w:val="es-MX"/>
+        </w:rPr>
+      </w:pPr>
+      <w:r>
+        <w:rPr>
+          <w:noProof/>
+          <w:lang w:val="es-MX"/>
+        </w:rPr>
+        <w:drawing>
+          <wp:inline distT="0" distB="0" distL="0" distR="0" wp14:anchorId="33B12810" wp14:editId="4E77D556">
+            <wp:extent cx="5943600" cy="4731385"/>
+            <wp:effectExtent l="0" t="0" r="0" b="0"/>
+            <wp:docPr id="2107548726" name="Picture 1"/>
+            <wp:cNvGraphicFramePr>
+              <a:graphicFrameLocks xmlns:a="http://schemas.openxmlformats.org/drawingml/2006/main" noChangeAspect="1"/>
+            </wp:cNvGraphicFramePr>
+            <a:graphic xmlns:a="http://schemas.openxmlformats.org/drawingml/2006/main">
+              <a:graphicData uri="http://schemas.openxmlformats.org/drawingml/2006/picture">
+                <pic:pic xmlns:pic="http://schemas.openxmlformats.org/drawingml/2006/picture">
+                  <pic:nvPicPr>
+                    <pic:cNvPr id="2107548726" name=""/>
+                    <pic:cNvPicPr/>
+                  </pic:nvPicPr>
+                  <pic:blipFill>
+                    <a:blip r:embed="rId15"/>
+                    <a:stretch>
+                      <a:fillRect/>
+                    </a:stretch>
+                  </pic:blipFill>
+                  <pic:spPr>
+                    <a:xfrm>
+                      <a:off x="0" y="0"/>
+                      <a:ext cx="5943600" cy="4731385"/>
+                    </a:xfrm>
+                    <a:prstGeom prst="rect">
+                      <a:avLst/>
+                    </a:prstGeom>
+                  </pic:spPr>
+                </pic:pic>
+              </a:graphicData>
+            </a:graphic>
+          </wp:inline>
+        </w:drawing>
+      </w:r>
+    </w:p>
+    <w:p>
+      <w:pPr>
+        <w:rPr>
+          <w:lang w:val="es-MX"/>
+        </w:rPr>
+      </w:pPr>
+      <w:r>
+        <w:rPr>
+          <w:lang w:val="es-MX"/>
+        </w:rPr>
+        <w:t xml:space="preserve">Aquí se explica que CS en </w:t>
+      </w:r>
+      <w:proofErr w:type="spellStart"/>
+      <w:r>
+        <w:rPr>
+          <w:lang w:val="es-MX"/>
+        </w:rPr>
+        <w:t>low</w:t>
+      </w:r>
+      <w:proofErr w:type="spellEnd"/>
+      <w:r>
+        <w:rPr>
+          <w:lang w:val="es-MX"/>
+        </w:rPr>
+        <w:t xml:space="preserve"> empieza la transmisión, y que se </w:t>
+      </w:r>
+      <w:proofErr w:type="spellStart"/>
+      <w:r>
+        <w:rPr>
+          <w:lang w:val="es-MX"/>
+        </w:rPr>
+        <w:t>peuden</w:t>
+      </w:r>
+      <w:proofErr w:type="spellEnd"/>
+      <w:r>
+        <w:rPr>
+          <w:lang w:val="es-MX"/>
+        </w:rPr>
+        <w:t xml:space="preserve"> tener múltiplos de 8 bits para los paquetes de data; se puede inferir que es MSB porque el bit 8-15 empieza en DI7, y que el modo del CPOL 0 (</w:t>
+      </w:r>
+      <w:proofErr w:type="spellStart"/>
+      <w:r>
+        <w:rPr>
+          <w:lang w:val="es-MX"/>
+        </w:rPr>
+        <w:t>falling</w:t>
+      </w:r>
+      <w:proofErr w:type="spellEnd"/>
+      <w:r>
+        <w:rPr>
+          <w:lang w:val="es-MX"/>
+        </w:rPr>
+        <w:t xml:space="preserve"> </w:t>
+      </w:r>
+      <w:proofErr w:type="spellStart"/>
+      <w:r>
+        <w:rPr>
+          <w:lang w:val="es-MX"/>
+        </w:rPr>
+        <w:t>edge</w:t>
+      </w:r>
+      <w:proofErr w:type="spellEnd"/>
+      <w:r>
+        <w:rPr>
+          <w:lang w:val="es-MX"/>
+        </w:rPr>
+        <w:t>) y CPHA es</w:t>
+      </w:r>
+      <w:r>
+        <w:rPr>
+          <w:lang w:val="es-MX"/>
+        </w:rPr>
+        <w:t xml:space="preserve"> 0 (1 </w:t>
+      </w:r>
+      <w:proofErr w:type="spellStart"/>
+      <w:r>
+        <w:rPr>
+          <w:lang w:val="es-MX"/>
+        </w:rPr>
+        <w:t>edge</w:t>
+      </w:r>
+      <w:proofErr w:type="spellEnd"/>
+      <w:r>
+        <w:rPr>
+          <w:lang w:val="es-MX"/>
+        </w:rPr>
+        <w:t>).</w:t>
+      </w:r>
+    </w:p>
+    <w:p>
+      <w:pPr>
+        <w:rPr>
+          <w:lang w:val="es-MX"/>
+        </w:rPr>
+      </w:pPr>
+    </w:p>
+    <w:p>
+      <w:pPr>
+        <w:rPr>
+          <w:lang w:val="es-MX"/>
+        </w:rPr>
+      </w:pPr>
+      <w:r>
+        <w:rPr>
+          <w:lang w:val="es-MX"/>
+        </w:rPr>
+        <w:t xml:space="preserve">Ahora generamos el SPI desde </w:t>
+      </w:r>
+      <w:proofErr w:type="spellStart"/>
+      <w:r>
+        <w:rPr>
+          <w:lang w:val="es-MX"/>
+        </w:rPr>
+        <w:t>cubeMX</w:t>
+      </w:r>
+      <w:proofErr w:type="spellEnd"/>
+      <w:r>
+        <w:rPr>
+          <w:lang w:val="es-MX"/>
+        </w:rPr>
+        <w:t xml:space="preserve"> con esos parámetros:</w:t>
+      </w:r>
+    </w:p>
+    <w:p>
+      <w:pPr>
+        <w:rPr>
+          <w:lang w:val="es-MX"/>
+        </w:rPr>
+      </w:pPr>
+      <w:r>
+        <w:rPr>
+          <w:noProof/>
+          <w:lang w:val="es-MX"/>
+        </w:rPr>
+        <w:lastRenderedPageBreak/>
+        <w:drawing>
+          <wp:inline distT="0" distB="0" distL="0" distR="0" wp14:anchorId="0D750E69" wp14:editId="7C936BB4">
+            <wp:extent cx="5943600" cy="6614795"/>
+            <wp:effectExtent l="0" t="0" r="0" b="0"/>
+            <wp:docPr id="2002652336" name="Picture 1"/>
+            <wp:cNvGraphicFramePr>
+              <a:graphicFrameLocks xmlns:a="http://schemas.openxmlformats.org/drawingml/2006/main" noChangeAspect="1"/>
+            </wp:cNvGraphicFramePr>
+            <a:graphic xmlns:a="http://schemas.openxmlformats.org/drawingml/2006/main">
+              <a:graphicData uri="http://schemas.openxmlformats.org/drawingml/2006/picture">
+                <pic:pic xmlns:pic="http://schemas.openxmlformats.org/drawingml/2006/picture">
+                  <pic:nvPicPr>
+                    <pic:cNvPr id="2002652336" name=""/>
+                    <pic:cNvPicPr/>
+                  </pic:nvPicPr>
+                  <pic:blipFill>
+                    <a:blip r:embed="rId16"/>
+                    <a:stretch>
+                      <a:fillRect/>
+                    </a:stretch>
+                  </pic:blipFill>
+                  <pic:spPr>
+                    <a:xfrm>
+                      <a:off x="0" y="0"/>
+                      <a:ext cx="5943600" cy="6614795"/>
+                    </a:xfrm>
+                    <a:prstGeom prst="rect">
+                      <a:avLst/>
+                    </a:prstGeom>
+                  </pic:spPr>
+                </pic:pic>
+              </a:graphicData>
+            </a:graphic>
+          </wp:inline>
+        </w:drawing>
+      </w:r>
+    </w:p>
+    <w:p>
+      <w:pPr>
+        <w:rPr>
+          <w:lang w:val="es-MX"/>
+        </w:rPr>
+      </w:pPr>
+      <w:r>
+        <w:rPr>
+          <w:lang w:val="es-MX"/>
+        </w:rPr>
+        <w:t xml:space="preserve">Se habilita el control de NSS (CS) por hardware para que sea más preciso el timing del CS, eliminando error humano por software que pueda consumir </w:t>
+      </w:r>
+      <w:proofErr w:type="spellStart"/>
+      <w:r>
+        <w:rPr>
+          <w:lang w:val="es-MX"/>
+        </w:rPr>
+        <w:t>mas</w:t>
+      </w:r>
+      <w:proofErr w:type="spellEnd"/>
+      <w:r>
+        <w:rPr>
+          <w:lang w:val="es-MX"/>
+        </w:rPr>
+        <w:t xml:space="preserve"> corriente.</w:t>
+      </w:r>
+    </w:p>
+    <w:p>
+      <w:pPr>
+        <w:rPr>
+          <w:lang w:val="es-MX"/>
+        </w:rPr>
+      </w:pPr>
+      <w:r>
+        <w:rPr>
+          <w:noProof/>
+          <w:lang w:val="es-MX"/>
+        </w:rPr>
+        <w:lastRenderedPageBreak/>
+        <w:drawing>
+          <wp:inline distT="0" distB="0" distL="0" distR="0" wp14:anchorId="5D293B35" wp14:editId="785FECEE">
+            <wp:extent cx="5943600" cy="1017270"/>
+            <wp:effectExtent l="0" t="0" r="0" b="0"/>
+            <wp:docPr id="1788041382" name="Picture 1"/>
+            <wp:cNvGraphicFramePr>
+              <a:graphicFrameLocks xmlns:a="http://schemas.openxmlformats.org/drawingml/2006/main" noChangeAspect="1"/>
+            </wp:cNvGraphicFramePr>
+            <a:graphic xmlns:a="http://schemas.openxmlformats.org/drawingml/2006/main">
+              <a:graphicData uri="http://schemas.openxmlformats.org/drawingml/2006/picture">
+                <pic:pic xmlns:pic="http://schemas.openxmlformats.org/drawingml/2006/picture">
+                  <pic:nvPicPr>
+                    <pic:cNvPr id="1788041382" name=""/>
+                    <pic:cNvPicPr/>
+                  </pic:nvPicPr>
+                  <pic:blipFill>
+                    <a:blip r:embed="rId17"/>
+                    <a:stretch>
+                      <a:fillRect/>
+                    </a:stretch>
+                  </pic:blipFill>
+                  <pic:spPr>
+                    <a:xfrm>
+                      <a:off x="0" y="0"/>
+                      <a:ext cx="5943600" cy="1017270"/>
+                    </a:xfrm>
+                    <a:prstGeom prst="rect">
+                      <a:avLst/>
+                    </a:prstGeom>
+                  </pic:spPr>
+                </pic:pic>
+              </a:graphicData>
+            </a:graphic>
+          </wp:inline>
+        </w:drawing>
+      </w:r>
+    </w:p>
+    <w:p>
+      <w:pPr>
+        <w:rPr>
+          <w:lang w:val="es-MX"/>
+        </w:rPr>
+      </w:pPr>
+    </w:p>
+    <w:p>
+      <w:pPr>
+        <w:rPr>
+          <w:lang w:val="es-MX"/>
+        </w:rPr>
+      </w:pPr>
+    </w:p>
+    <w:p>
+      <w:pPr>
+        <w:rPr>
+          <w:lang w:val="es-MX"/>
+        </w:rPr>
+      </w:pPr>
+    </w:p>
+    <w:p>
+      <w:pPr>
+        <w:rPr>
+          <w:lang w:val="es-MX"/>
+        </w:rPr>
+      </w:pPr>
+      <w:r>
+        <w:rPr>
+          <w:lang w:val="es-MX"/>
+        </w:rPr>
+        <w:t>Se habilita: “</w:t>
+      </w:r>
+      <w:r>
+        <w:rPr>
+          <w:lang w:val="es-MX"/>
+        </w:rPr>
+        <w:t xml:space="preserve">Set </w:t>
+      </w:r>
+      <w:proofErr w:type="spellStart"/>
+      <w:r>
+        <w:rPr>
+          <w:lang w:val="es-MX"/>
+        </w:rPr>
+        <w:t>all</w:t>
+      </w:r>
+      <w:proofErr w:type="spellEnd"/>
+      <w:r>
+        <w:rPr>
+          <w:lang w:val="es-MX"/>
+        </w:rPr>
+        <w:t xml:space="preserve"> free </w:t>
+      </w:r>
+      <w:proofErr w:type="spellStart"/>
+      <w:r>
+        <w:rPr>
+          <w:lang w:val="es-MX"/>
+        </w:rPr>
+        <w:t>pins</w:t>
+      </w:r>
+      <w:proofErr w:type="spellEnd"/>
+      <w:r>
+        <w:rPr>
+          <w:lang w:val="es-MX"/>
+        </w:rPr>
+        <w:t xml:space="preserve"> as </w:t>
+      </w:r>
+      <w:proofErr w:type="spellStart"/>
+      <w:r>
+        <w:rPr>
+          <w:lang w:val="es-MX"/>
+        </w:rPr>
+        <w:t>analog</w:t>
+      </w:r>
+      <w:proofErr w:type="spellEnd"/>
+      <w:r>
+        <w:rPr>
+          <w:lang w:val="es-MX"/>
+        </w:rPr>
+        <w:t xml:space="preserve"> </w:t>
+      </w:r>
+      <w:proofErr w:type="spellStart"/>
+      <w:r>
+        <w:rPr>
+          <w:lang w:val="es-MX"/>
+        </w:rPr>
+        <w:t>to</w:t>
+      </w:r>
+      <w:proofErr w:type="spellEnd"/>
+      <w:r>
+        <w:rPr>
+          <w:lang w:val="es-MX"/>
+        </w:rPr>
+        <w:t xml:space="preserve"> reduce </w:t>
+      </w:r>
+      <w:proofErr w:type="spellStart"/>
+      <w:r>
+        <w:rPr>
+          <w:lang w:val="es-MX"/>
+        </w:rPr>
+        <w:t>power</w:t>
+      </w:r>
+      <w:proofErr w:type="spellEnd"/>
+      <w:r>
+        <w:rPr>
+          <w:lang w:val="es-MX"/>
+        </w:rPr>
+        <w:t xml:space="preserve"> </w:t>
+      </w:r>
+      <w:proofErr w:type="spellStart"/>
+      <w:r>
+        <w:rPr>
+          <w:lang w:val="es-MX"/>
+        </w:rPr>
+        <w:t>consumption</w:t>
+      </w:r>
+      <w:proofErr w:type="spellEnd"/>
+      <w:r>
+        <w:rPr>
+          <w:lang w:val="es-MX"/>
+        </w:rPr>
+        <w:t>”</w:t>
+      </w:r>
+    </w:p>
+    <w:p>
+      <w:pPr>
+        <w:rPr>
+          <w:lang w:val="es-MX"/>
+        </w:rPr>
+      </w:pPr>
+      <w:r>
+        <w:rPr>
+          <w:noProof/>
+          <w:lang w:val="es-MX"/>
+        </w:rPr>
+        <w:drawing>
+          <wp:inline distT="0" distB="0" distL="0" distR="0" wp14:anchorId="207E32E8" wp14:editId="5E664BD3">
+            <wp:extent cx="5943600" cy="1802765"/>
+            <wp:effectExtent l="0" t="0" r="0" b="6985"/>
+            <wp:docPr id="149929909" name="Picture 1"/>
+            <wp:cNvGraphicFramePr>
+              <a:graphicFrameLocks xmlns:a="http://schemas.openxmlformats.org/drawingml/2006/main" noChangeAspect="1"/>
+            </wp:cNvGraphicFramePr>
+            <a:graphic xmlns:a="http://schemas.openxmlformats.org/drawingml/2006/main">
+              <a:graphicData uri="http://schemas.openxmlformats.org/drawingml/2006/picture">
+                <pic:pic xmlns:pic="http://schemas.openxmlformats.org/drawingml/2006/picture">
+                  <pic:nvPicPr>
+                    <pic:cNvPr id="149929909" name=""/>
+                    <pic:cNvPicPr/>
+                  </pic:nvPicPr>
+                  <pic:blipFill>
+                    <a:blip r:embed="rId18"/>
+                    <a:stretch>
+                      <a:fillRect/>
+                    </a:stretch>
+                  </pic:blipFill>
+                  <pic:spPr>
+                    <a:xfrm>
+                      <a:off x="0" y="0"/>
+                      <a:ext cx="5943600" cy="1802765"/>
+                    </a:xfrm>
+                    <a:prstGeom prst="rect">
+                      <a:avLst/>
+                    </a:prstGeom>
+                  </pic:spPr>
+                </pic:pic>
+              </a:graphicData>
+            </a:graphic>
+          </wp:inline>
+        </w:drawing>
+      </w:r>
+    </w:p>
+    <w:p>
+      <w:pPr>
+        <w:rPr>
+          <w:lang w:val="es-MX"/>
+        </w:rPr>
+      </w:pPr>
+    </w:p>
+    <w:p>
+      <w:pPr>
+        <w:rPr>
+          <w:lang w:val="es-MX"/>
+        </w:rPr>
+      </w:pPr>
+      <w:r>
+        <w:rPr>
+          <w:lang w:val="es-MX"/>
+        </w:rPr>
+        <w:t xml:space="preserve">Se </w:t>
+      </w:r>
+      <w:r>
+        <w:rPr>
+          <w:lang w:val="es-MX"/>
+        </w:rPr>
+        <w:t>genera</w:t>
+      </w:r>
+      <w:r>
+        <w:rPr>
+          <w:lang w:val="es-MX"/>
+        </w:rPr>
+        <w:t xml:space="preserve"> el proyecto bajo estas características:</w:t>
+      </w:r>
+    </w:p>
+    <w:p>
+      <w:pPr>
+        <w:rPr>
+          <w:lang w:val="es-MX"/>
+        </w:rPr>
+      </w:pPr>
+      <w:r>
+        <w:rPr>
+          <w:noProof/>
+          <w:lang w:val="es-MX"/>
+        </w:rPr>
+        <w:drawing>
+          <wp:inline distT="0" distB="0" distL="0" distR="0" wp14:anchorId="1673F066" wp14:editId="5A6D04B3">
+            <wp:extent cx="5943600" cy="1446530"/>
+            <wp:effectExtent l="0" t="0" r="0" b="1270"/>
+            <wp:docPr id="1501548051" name="Picture 1"/>
+            <wp:cNvGraphicFramePr>
+              <a:graphicFrameLocks xmlns:a="http://schemas.openxmlformats.org/drawingml/2006/main" noChangeAspect="1"/>
+            </wp:cNvGraphicFramePr>
+            <a:graphic xmlns:a="http://schemas.openxmlformats.org/drawingml/2006/main">
+              <a:graphicData uri="http://schemas.openxmlformats.org/drawingml/2006/picture">
+                <pic:pic xmlns:pic="http://schemas.openxmlformats.org/drawingml/2006/picture">
+                  <pic:nvPicPr>
+                    <pic:cNvPr id="1501548051" name=""/>
+                    <pic:cNvPicPr/>
+                  </pic:nvPicPr>
+                  <pic:blipFill>
+                    <a:blip r:embed="rId19"/>
+                    <a:stretch>
+                      <a:fillRect/>
+                    </a:stretch>
+                  </pic:blipFill>
+                  <pic:spPr>
+                    <a:xfrm>
+                      <a:off x="0" y="0"/>
+                      <a:ext cx="5943600" cy="1446530"/>
+                    </a:xfrm>
+                    <a:prstGeom prst="rect">
+                      <a:avLst/>
+                    </a:prstGeom>
+                  </pic:spPr>
+                </pic:pic>
+              </a:graphicData>
+            </a:graphic>
+          </wp:inline>
+        </w:drawing>
+      </w:r>
+    </w:p>
+    <w:p>
+      <w:pPr>
+        <w:rPr>
+          <w:lang w:val="es-MX"/>
+        </w:rPr>
+      </w:pPr>
+      <w:r>
+        <w:rPr>
+          <w:b/>
+          <w:bCs/>
+          <w:lang w:val="es-MX"/>
+        </w:rPr>
+        <w:t>Nota:</w:t>
+      </w:r>
+      <w:r>
+        <w:rPr>
+          <w:lang w:val="es-MX"/>
+        </w:rPr>
+        <w:t xml:space="preserve"> Se recomienda </w:t>
+      </w:r>
+      <w:proofErr w:type="spellStart"/>
+      <w:r>
+        <w:rPr>
+          <w:lang w:val="es-MX"/>
+        </w:rPr>
+        <w:t>setear</w:t>
+      </w:r>
+      <w:proofErr w:type="spellEnd"/>
+      <w:r>
+        <w:rPr>
+          <w:lang w:val="es-MX"/>
+        </w:rPr>
+        <w:t xml:space="preserve"> SMPS para tener el menor consumo de corriente; En este ejercicio no se </w:t>
+      </w:r>
+      <w:proofErr w:type="spellStart"/>
+      <w:r>
+        <w:rPr>
+          <w:lang w:val="es-MX"/>
+        </w:rPr>
+        <w:t>setea</w:t>
+      </w:r>
+      <w:proofErr w:type="spellEnd"/>
+      <w:r>
+        <w:rPr>
+          <w:lang w:val="es-MX"/>
+        </w:rPr>
+        <w:t xml:space="preserve"> debido a que depende de hardware</w:t>
+      </w:r>
+      <w:r>
+        <w:rPr>
+          <w:lang w:val="es-MX"/>
+        </w:rPr>
+        <w:t xml:space="preserve"> que no se tiene a la mano.</w:t>
+      </w:r>
+    </w:p>
+    <w:p>
+      <w:pPr>
+        <w:rPr>
+          <w:lang w:val="es-MX"/>
+        </w:rPr>
+      </w:pPr>
+      <w:r>
+        <w:rPr>
+          <w:lang w:val="es-MX"/>
+        </w:rPr>
+        <w:t>Se activa e</w:t>
+      </w:r>
+      <w:r>
+        <w:rPr>
+          <w:lang w:val="es-MX"/>
+        </w:rPr>
+        <w:t>n e</w:t>
+      </w:r>
+      <w:r>
+        <w:rPr>
+          <w:lang w:val="es-MX"/>
+        </w:rPr>
+        <w:t>sta opción</w:t>
+      </w:r>
+    </w:p>
+    <w:p>
+      <w:pPr>
+        <w:rPr>
+          <w:lang w:val="es-MX"/>
+        </w:rPr>
+      </w:pPr>
+      <w:r>
+        <w:rPr>
+          <w:lang w:val="es-MX"/>
+        </w:rPr>
+        <w:lastRenderedPageBreak/>
+        <w:drawing>
+          <wp:inline distT="0" distB="0" distL="0" distR="0" wp14:anchorId="7CB40126" wp14:editId="1866FB0E">
+            <wp:extent cx="5943600" cy="6635115"/>
+            <wp:effectExtent l="0" t="0" r="0" b="0"/>
+            <wp:docPr id="403002847" name="Picture 1"/>
+            <wp:cNvGraphicFramePr>
+              <a:graphicFrameLocks xmlns:a="http://schemas.openxmlformats.org/drawingml/2006/main" noChangeAspect="1"/>
+            </wp:cNvGraphicFramePr>
+            <a:graphic xmlns:a="http://schemas.openxmlformats.org/drawingml/2006/main">
+              <a:graphicData uri="http://schemas.openxmlformats.org/drawingml/2006/picture">
+                <pic:pic xmlns:pic="http://schemas.openxmlformats.org/drawingml/2006/picture">
+                  <pic:nvPicPr>
+                    <pic:cNvPr id="403002847" name=""/>
+                    <pic:cNvPicPr/>
+                  </pic:nvPicPr>
+                  <pic:blipFill>
+                    <a:blip r:embed="rId20"/>
+                    <a:stretch>
+                      <a:fillRect/>
+                    </a:stretch>
+                  </pic:blipFill>
+                  <pic:spPr>
+                    <a:xfrm>
+                      <a:off x="0" y="0"/>
+                      <a:ext cx="5943600" cy="6635115"/>
+                    </a:xfrm>
+                    <a:prstGeom prst="rect">
+                      <a:avLst/>
+                    </a:prstGeom>
+                  </pic:spPr>
+                </pic:pic>
+              </a:graphicData>
+            </a:graphic>
+          </wp:inline>
+        </w:drawing>
+      </w:r>
+    </w:p>
+    <w:p>
+      <w:pPr>
+        <w:rPr>
+          <w:lang w:val="es-MX"/>
+        </w:rPr>
+      </w:pPr>
+    </w:p>
+    <w:p>
+      <w:pPr>
+        <w:rPr>
+          <w:lang w:val="es-MX"/>
+        </w:rPr>
+      </w:pPr>
+    </w:p>
+    <w:p>
+      <w:pPr>
+        <w:rPr>
+          <w:lang w:val="es-MX"/>
+        </w:rPr>
+      </w:pPr>
+    </w:p>
+    <w:p>
+      <w:pPr>
+        <w:pStyle w:val="Heading1"/>
+        <w:rPr>
+          <w:lang w:val="es-MX"/>
+        </w:rPr>
+      </w:pPr>
+      <w:proofErr w:type="spellStart"/>
+      <w:r>
+        <w:rPr>
+          <w:lang w:val="es-MX"/>
+        </w:rPr>
+        <w:lastRenderedPageBreak/>
+        <w:t>Setea</w:t>
+      </w:r>
+      <w:r>
+        <w:rPr>
+          <w:lang w:val="es-MX"/>
+        </w:rPr>
+        <w:t>r</w:t>
+      </w:r>
+      <w:proofErr w:type="spellEnd"/>
+      <w:r>
+        <w:rPr>
+          <w:lang w:val="es-MX"/>
+        </w:rPr>
+        <w:t xml:space="preserve"> el proyecto en STM32CubeIDE</w:t>
+      </w:r>
+    </w:p>
+    <w:p>
+      <w:pPr>
+        <w:rPr>
+          <w:lang w:val="es-MX"/>
+        </w:rPr>
+      </w:pPr>
+      <w:r>
+        <w:rPr>
+          <w:noProof/>
+          <w:lang w:val="es-MX"/>
+        </w:rPr>
+        <w:drawing>
+          <wp:inline distT="0" distB="0" distL="0" distR="0" wp14:anchorId="3A49376A" wp14:editId="25DFAAC3">
+            <wp:extent cx="3296110" cy="5487166"/>
+            <wp:effectExtent l="0" t="0" r="0" b="0"/>
+            <wp:docPr id="155759413" name="Picture 1"/>
+            <wp:cNvGraphicFramePr>
+              <a:graphicFrameLocks xmlns:a="http://schemas.openxmlformats.org/drawingml/2006/main" noChangeAspect="1"/>
+            </wp:cNvGraphicFramePr>
+            <a:graphic xmlns:a="http://schemas.openxmlformats.org/drawingml/2006/main">
+              <a:graphicData uri="http://schemas.openxmlformats.org/drawingml/2006/picture">
+                <pic:pic xmlns:pic="http://schemas.openxmlformats.org/drawingml/2006/picture">
+                  <pic:nvPicPr>
+                    <pic:cNvPr id="155759413" name=""/>
+                    <pic:cNvPicPr/>
+                  </pic:nvPicPr>
+                  <pic:blipFill>
+                    <a:blip r:embed="rId21"/>
+                    <a:stretch>
+                      <a:fillRect/>
+                    </a:stretch>
+                  </pic:blipFill>
+                  <pic:spPr>
+                    <a:xfrm>
+                      <a:off x="0" y="0"/>
+                      <a:ext cx="3296110" cy="5487166"/>
+                    </a:xfrm>
+                    <a:prstGeom prst="rect">
+                      <a:avLst/>
+                    </a:prstGeom>
+                  </pic:spPr>
+                </pic:pic>
+              </a:graphicData>
+            </a:graphic>
+          </wp:inline>
+        </w:drawing>
+      </w:r>
+      <w:r>
+        <w:rPr>
+          <w:lang w:val="es-MX"/>
+        </w:rPr>
+        <w:t xml:space="preserve"> </w:t>
+      </w:r>
+    </w:p>
+    <w:p>
+      <w:pPr>
+        <w:rPr>
+          <w:lang w:val="es-MX"/>
+        </w:rPr>
+      </w:pPr>
+      <w:r>
+        <w:rPr>
+          <w:lang w:val="es-MX"/>
+        </w:rPr>
+        <w:t xml:space="preserve">Open </w:t>
+      </w:r>
+      <w:proofErr w:type="spellStart"/>
+      <w:r>
+        <w:rPr>
+          <w:lang w:val="es-MX"/>
+        </w:rPr>
+        <w:t>projects</w:t>
+      </w:r>
+      <w:proofErr w:type="spellEnd"/>
+      <w:r>
+        <w:rPr>
+          <w:lang w:val="es-MX"/>
+        </w:rPr>
+        <w:t xml:space="preserve"> </w:t>
+      </w:r>
+      <w:proofErr w:type="spellStart"/>
+      <w:r>
+        <w:rPr>
+          <w:lang w:val="es-MX"/>
+        </w:rPr>
+        <w:t>from</w:t>
+      </w:r>
+      <w:proofErr w:type="spellEnd"/>
+      <w:r>
+        <w:rPr>
+          <w:lang w:val="es-MX"/>
+        </w:rPr>
+        <w:t xml:space="preserve"> file </w:t>
+      </w:r>
+      <w:proofErr w:type="spellStart"/>
+      <w:r>
+        <w:rPr>
+          <w:lang w:val="es-MX"/>
+        </w:rPr>
+        <w:t>system</w:t>
+      </w:r>
+      <w:proofErr w:type="spellEnd"/>
+    </w:p>
+    <w:p>
+      <w:pPr>
+        <w:rPr>
+          <w:lang w:val="es-MX"/>
+        </w:rPr>
+      </w:pPr>
+      <w:r>
+        <w:rPr>
+          <w:lang w:val="es-MX"/>
+        </w:rPr>
+        <w:t xml:space="preserve">Seleccionar el directorio donde se generó el </w:t>
+      </w:r>
+      <w:proofErr w:type="spellStart"/>
+      <w:r>
+        <w:rPr>
+          <w:lang w:val="es-MX"/>
+        </w:rPr>
+        <w:t>proeycto</w:t>
+      </w:r>
+      <w:proofErr w:type="spellEnd"/>
+      <w:r>
+        <w:rPr>
+          <w:lang w:val="es-MX"/>
+        </w:rPr>
+        <w:t xml:space="preserve"> con STM32CubeMX</w:t>
+      </w:r>
+    </w:p>
+    <w:p>
+      <w:pPr>
+        <w:rPr>
+          <w:lang w:val="es-MX"/>
+        </w:rPr>
+      </w:pPr>
+      <w:r>
+        <w:rPr>
+          <w:noProof/>
+          <w:lang w:val="es-MX"/>
+        </w:rPr>
+        <w:lastRenderedPageBreak/>
+        <w:drawing>
+          <wp:inline distT="0" distB="0" distL="0" distR="0" wp14:anchorId="3862805D" wp14:editId="19A5B22D">
+            <wp:extent cx="5943600" cy="4262120"/>
+            <wp:effectExtent l="0" t="0" r="0" b="5080"/>
+            <wp:docPr id="2010763207" name="Picture 1"/>
+            <wp:cNvGraphicFramePr>
+              <a:graphicFrameLocks xmlns:a="http://schemas.openxmlformats.org/drawingml/2006/main" noChangeAspect="1"/>
+            </wp:cNvGraphicFramePr>
+            <a:graphic xmlns:a="http://schemas.openxmlformats.org/drawingml/2006/main">
+              <a:graphicData uri="http://schemas.openxmlformats.org/drawingml/2006/picture">
+                <pic:pic xmlns:pic="http://schemas.openxmlformats.org/drawingml/2006/picture">
+                  <pic:nvPicPr>
+                    <pic:cNvPr id="2010763207" name=""/>
+                    <pic:cNvPicPr/>
+                  </pic:nvPicPr>
+                  <pic:blipFill>
+                    <a:blip r:embed="rId22"/>
+                    <a:stretch>
+                      <a:fillRect/>
+                    </a:stretch>
+                  </pic:blipFill>
+                  <pic:spPr>
+                    <a:xfrm>
+                      <a:off x="0" y="0"/>
+                      <a:ext cx="5943600" cy="4262120"/>
+                    </a:xfrm>
+                    <a:prstGeom prst="rect">
+                      <a:avLst/>
+                    </a:prstGeom>
+                  </pic:spPr>
+                </pic:pic>
+              </a:graphicData>
+            </a:graphic>
+          </wp:inline>
+        </w:drawing>
+      </w:r>
+    </w:p>
+    <w:p>
+      <w:pPr>
+        <w:rPr>
+          <w:lang w:val="es-MX"/>
+        </w:rPr>
+      </w:pPr>
+      <w:r>
+        <w:rPr>
+          <w:lang w:val="es-MX"/>
+        </w:rPr>
+        <w:t>Creé los siguientes folders para una estructura más modular del código:</w:t>
+      </w:r>
+    </w:p>
+    <w:p>
+      <w:pPr>
+        <w:rPr>
+          <w:lang w:val="es-MX"/>
+        </w:rPr>
+      </w:pPr>
+      <w:r>
+        <w:rPr>
+          <w:noProof/>
+          <w:lang w:val="es-MX"/>
+        </w:rPr>
+        <w:drawing>
+          <wp:inline distT="0" distB="0" distL="0" distR="0" wp14:anchorId="39D053A1" wp14:editId="08250B74">
+            <wp:extent cx="2648320" cy="1428949"/>
+            <wp:effectExtent l="0" t="0" r="0" b="0"/>
+            <wp:docPr id="2033183204" name="Picture 1"/>
+            <wp:cNvGraphicFramePr>
+              <a:graphicFrameLocks xmlns:a="http://schemas.openxmlformats.org/drawingml/2006/main" noChangeAspect="1"/>
+            </wp:cNvGraphicFramePr>
+            <a:graphic xmlns:a="http://schemas.openxmlformats.org/drawingml/2006/main">
+              <a:graphicData uri="http://schemas.openxmlformats.org/drawingml/2006/picture">
+                <pic:pic xmlns:pic="http://schemas.openxmlformats.org/drawingml/2006/picture">
+                  <pic:nvPicPr>
+                    <pic:cNvPr id="2033183204" name=""/>
+                    <pic:cNvPicPr/>
+                  </pic:nvPicPr>
+                  <pic:blipFill>
+                    <a:blip r:embed="rId23"/>
+                    <a:stretch>
+                      <a:fillRect/>
+                    </a:stretch>
+                  </pic:blipFill>
+                  <pic:spPr>
+                    <a:xfrm>
+                      <a:off x="0" y="0"/>
+                      <a:ext cx="2648320" cy="1428949"/>
+                    </a:xfrm>
+                    <a:prstGeom prst="rect">
+                      <a:avLst/>
+                    </a:prstGeom>
+                  </pic:spPr>
+                </pic:pic>
+              </a:graphicData>
+            </a:graphic>
+          </wp:inline>
+        </w:drawing>
+      </w:r>
+    </w:p>
+    <w:p>
+      <w:pPr>
+        <w:rPr>
+          <w:lang w:val="es-MX"/>
+        </w:rPr>
+      </w:pPr>
+      <w:r>
+        <w:rPr>
+          <w:lang w:val="es-MX"/>
+        </w:rPr>
+        <w:t xml:space="preserve">Y estas las agregué en el </w:t>
+      </w:r>
+      <w:proofErr w:type="spellStart"/>
+      <w:r>
+        <w:rPr>
+          <w:lang w:val="es-MX"/>
+        </w:rPr>
+        <w:t>path</w:t>
+      </w:r>
+      <w:proofErr w:type="spellEnd"/>
+      <w:r>
+        <w:rPr>
+          <w:lang w:val="es-MX"/>
+        </w:rPr>
+        <w:t xml:space="preserve"> de </w:t>
+      </w:r>
+      <w:proofErr w:type="spellStart"/>
+      <w:r>
+        <w:rPr>
+          <w:lang w:val="es-MX"/>
+        </w:rPr>
+        <w:t>sources</w:t>
+      </w:r>
+      <w:proofErr w:type="spellEnd"/>
+      <w:r>
+        <w:rPr>
+          <w:lang w:val="es-MX"/>
+        </w:rPr>
+        <w:t>:</w:t>
+      </w:r>
+    </w:p>
+    <w:p>
+      <w:pPr>
+        <w:rPr>
+          <w:lang w:val="es-MX"/>
+        </w:rPr>
+      </w:pPr>
+      <w:r>
+        <w:rPr>
+          <w:noProof/>
+          <w:lang w:val="es-MX"/>
+        </w:rPr>
+        <w:lastRenderedPageBreak/>
+        <w:drawing>
+          <wp:inline distT="0" distB="0" distL="0" distR="0" wp14:anchorId="3864D299" wp14:editId="490C029D">
+            <wp:extent cx="5943600" cy="4879975"/>
+            <wp:effectExtent l="0" t="0" r="0" b="0"/>
+            <wp:docPr id="117419319" name="Picture 1"/>
+            <wp:cNvGraphicFramePr>
+              <a:graphicFrameLocks xmlns:a="http://schemas.openxmlformats.org/drawingml/2006/main" noChangeAspect="1"/>
+            </wp:cNvGraphicFramePr>
+            <a:graphic xmlns:a="http://schemas.openxmlformats.org/drawingml/2006/main">
+              <a:graphicData uri="http://schemas.openxmlformats.org/drawingml/2006/picture">
+                <pic:pic xmlns:pic="http://schemas.openxmlformats.org/drawingml/2006/picture">
+                  <pic:nvPicPr>
+                    <pic:cNvPr id="117419319" name=""/>
+                    <pic:cNvPicPr/>
+                  </pic:nvPicPr>
+                  <pic:blipFill>
+                    <a:blip r:embed="rId24"/>
+                    <a:stretch>
+                      <a:fillRect/>
+                    </a:stretch>
+                  </pic:blipFill>
+                  <pic:spPr>
+                    <a:xfrm>
+                      <a:off x="0" y="0"/>
+                      <a:ext cx="5943600" cy="4879975"/>
+                    </a:xfrm>
+                    <a:prstGeom prst="rect">
+                      <a:avLst/>
+                    </a:prstGeom>
+                  </pic:spPr>
+                </pic:pic>
+              </a:graphicData>
+            </a:graphic>
+          </wp:inline>
+        </w:drawing>
+      </w:r>
+    </w:p>
+    <w:p>
+      <w:pPr>
+        <w:rPr>
+          <w:lang w:val="es-MX"/>
+        </w:rPr>
+      </w:pPr>
+      <w:r>
+        <w:rPr>
+          <w:noProof/>
+          <w:lang w:val="es-MX"/>
+        </w:rPr>
+        <w:drawing>
+          <wp:inline distT="0" distB="0" distL="0" distR="0" wp14:anchorId="3FC575E3" wp14:editId="669E5A7D">
+            <wp:extent cx="5943600" cy="1946910"/>
+            <wp:effectExtent l="0" t="0" r="0" b="0"/>
+            <wp:docPr id="517358217" name="Picture 1"/>
+            <wp:cNvGraphicFramePr>
+              <a:graphicFrameLocks xmlns:a="http://schemas.openxmlformats.org/drawingml/2006/main" noChangeAspect="1"/>
+            </wp:cNvGraphicFramePr>
+            <a:graphic xmlns:a="http://schemas.openxmlformats.org/drawingml/2006/main">
+              <a:graphicData uri="http://schemas.openxmlformats.org/drawingml/2006/picture">
+                <pic:pic xmlns:pic="http://schemas.openxmlformats.org/drawingml/2006/picture">
+                  <pic:nvPicPr>
+                    <pic:cNvPr id="517358217" name=""/>
+                    <pic:cNvPicPr/>
+                  </pic:nvPicPr>
+                  <pic:blipFill>
+                    <a:blip r:embed="rId25"/>
+                    <a:stretch>
+                      <a:fillRect/>
+                    </a:stretch>
+                  </pic:blipFill>
+                  <pic:spPr>
+                    <a:xfrm>
+                      <a:off x="0" y="0"/>
+                      <a:ext cx="5943600" cy="1946910"/>
+                    </a:xfrm>
+                    <a:prstGeom prst="rect">
+                      <a:avLst/>
+                    </a:prstGeom>
+                  </pic:spPr>
+                </pic:pic>
+              </a:graphicData>
+            </a:graphic>
+          </wp:inline>
+        </w:drawing>
+      </w:r>
+    </w:p>
+    <w:p>
+      <w:pPr>
+        <w:rPr>
+          <w:lang w:val="es-MX"/>
+        </w:rPr>
+      </w:pPr>
+    </w:p>
+    <w:p>
+      <w:pPr>
+        <w:rPr>
+          <w:lang w:val="es-MX"/>
+        </w:rPr>
+      </w:pPr>
+    </w:p>
+    <w:p>
+      <w:pPr>
+        <w:rPr>
+          <w:lang w:val="es-MX"/>
+        </w:rPr>
+      </w:pPr>
+    </w:p>
+    <w:p>
+      <w:pPr>
+        <w:rPr>
+          <w:lang w:val="es-MX"/>
+        </w:rPr>
+      </w:pPr>
+    </w:p>
+    <w:p>
+      <w:pPr>
+        <w:pStyle w:val="Heading1"/>
+        <w:rPr>
+          <w:lang w:val="es-MX"/>
+        </w:rPr>
+      </w:pPr>
+      <w:r>
+        <w:rPr>
+          <w:lang w:val="es-MX"/>
+        </w:rPr>
+        <w:lastRenderedPageBreak/>
+        <w:t xml:space="preserve">Firmware para Deep </w:t>
+      </w:r>
+      <w:proofErr w:type="spellStart"/>
+      <w:r>
+        <w:rPr>
+          <w:lang w:val="es-MX"/>
+        </w:rPr>
+        <w:t>sleep</w:t>
+      </w:r>
+      <w:proofErr w:type="spellEnd"/>
+      <w:r>
+        <w:rPr>
+          <w:lang w:val="es-MX"/>
+        </w:rPr>
+        <w:t>:</w:t>
+      </w:r>
+    </w:p>
+    <w:p>
+      <w:pPr>
+        <w:rPr>
+          <w:lang w:val="es-MX"/>
+        </w:rPr>
+      </w:pPr>
+      <w:r>
+        <w:rPr>
+          <w:lang w:val="es-MX"/>
+        </w:rPr>
+        <w:t xml:space="preserve">Deep </w:t>
+      </w:r>
+      <w:proofErr w:type="spellStart"/>
+      <w:r>
+        <w:rPr>
+          <w:lang w:val="es-MX"/>
+        </w:rPr>
+        <w:t>sleep</w:t>
+      </w:r>
+      <w:proofErr w:type="spellEnd"/>
+      <w:r>
+        <w:rPr>
+          <w:lang w:val="es-MX"/>
+        </w:rPr>
+        <w:t xml:space="preserve"> basado en AN5652</w:t>
+      </w:r>
+      <w:r>
+        <w:rPr>
+          <w:lang w:val="es-MX"/>
+        </w:rPr>
+        <w:br/>
+      </w:r>
+      <w:r>
+        <w:rPr>
+          <w:lang w:val="es-MX"/>
+        </w:rPr>
+        <w:drawing>
+          <wp:inline distT="0" distB="0" distL="0" distR="0" wp14:anchorId="4396B887" wp14:editId="6DDE9884">
+            <wp:extent cx="5943600" cy="2796540"/>
+            <wp:effectExtent l="0" t="0" r="0" b="3810"/>
+            <wp:docPr id="1304335817" name="Picture 1"/>
+            <wp:cNvGraphicFramePr>
+              <a:graphicFrameLocks xmlns:a="http://schemas.openxmlformats.org/drawingml/2006/main" noChangeAspect="1"/>
+            </wp:cNvGraphicFramePr>
+            <a:graphic xmlns:a="http://schemas.openxmlformats.org/drawingml/2006/main">
+              <a:graphicData uri="http://schemas.openxmlformats.org/drawingml/2006/picture">
+                <pic:pic xmlns:pic="http://schemas.openxmlformats.org/drawingml/2006/picture">
+                  <pic:nvPicPr>
+                    <pic:cNvPr id="1304335817" name=""/>
+                    <pic:cNvPicPr/>
+                  </pic:nvPicPr>
+                  <pic:blipFill>
+                    <a:blip r:embed="rId26"/>
+                    <a:stretch>
+                      <a:fillRect/>
+                    </a:stretch>
+                  </pic:blipFill>
+                  <pic:spPr>
+                    <a:xfrm>
+                      <a:off x="0" y="0"/>
+                      <a:ext cx="5943600" cy="2796540"/>
+                    </a:xfrm>
+                    <a:prstGeom prst="rect">
+                      <a:avLst/>
+                    </a:prstGeom>
+                  </pic:spPr>
+                </pic:pic>
+              </a:graphicData>
+            </a:graphic>
+          </wp:inline>
+        </w:drawing>
+      </w:r>
+    </w:p>
+    <w:p>
+      <w:pPr>
         <w:rPr>
           <w:lang w:val="es-MX"/>
         </w:rPr>
@@ -1076,6 +3090,7 @@
   <w:style w:type="character" w:default="1" w:styleId="DefaultParagraphFont">
     <w:name w:val="Default Paragraph Font"/>
     <w:uiPriority w:val="1"/>
+    <w:semiHidden/>
     <w:unhideWhenUsed/>
   </w:style>
   <w:style w:type="table" w:default="1" w:styleId="TableNormal">
@@ -1412,6 +3427,18 @@
       <w:shd w:val="clear" w:color="auto" w:fill="E1DFDD"/>
     </w:rPr>
   </w:style>
+  <w:style w:type="character" w:styleId="FollowedHyperlink">
+    <w:name w:val="FollowedHyperlink"/>
+    <w:basedOn w:val="DefaultParagraphFont"/>
+    <w:uiPriority w:val="99"/>
+    <w:semiHidden/>
+    <w:unhideWhenUsed/>
+    <w:rsid w:val="00FC59F9"/>
+    <w:rPr>
+      <w:color w:val="96607D" w:themeColor="followedHyperlink"/>
+      <w:u w:val="single"/>
+    </w:rPr>
+  </w:style>
 </w:styles>
 </file>
 

</xml_diff>

<commit_message>
feat: Updated .ioc to match lis2dw12 lib endianess
</commit_message>
<xml_diff>
--- a/methodology/metodologia.docx
+++ b/methodology/metodologia.docx
@@ -35,43 +35,21 @@
         <w:rPr>
           <w:lang w:val="es-MX"/>
         </w:rPr>
-        <w:t xml:space="preserve">2 familias de STM32 con consumo </w:t>
-      </w:r>
-      <w:proofErr w:type="spellStart"/>
-      <w:r>
-        <w:rPr>
-          <w:lang w:val="es-MX"/>
-        </w:rPr>
-        <w:t>ultrabajo</w:t>
-      </w:r>
-      <w:proofErr w:type="spellEnd"/>
-      <w:r>
-        <w:rPr>
-          <w:lang w:val="es-MX"/>
-        </w:rPr>
-        <w:t>, U5 y L4, del U5 ya he trabajado con el U575, con este perfil bajo STOP3</w:t>
-      </w:r>
-    </w:p>
-    <w:p>
-      <w:pPr>
-        <w:rPr>
-          <w:lang w:val="es-MX"/>
-        </w:rPr>
-      </w:pPr>
-      <w:r>
-        <w:rPr>
-          <w:lang w:val="es-MX"/>
-        </w:rPr>
-        <w:t xml:space="preserve">En STOP3 </w:t>
-      </w:r>
-      <w:proofErr w:type="spellStart"/>
-      <w:r>
-        <w:rPr>
-          <w:lang w:val="es-MX"/>
-        </w:rPr>
-        <w:t>mode</w:t>
-      </w:r>
-      <w:proofErr w:type="spellEnd"/>
+        <w:t>2 familias de STM32 con consumo ultrabajo, U5 y L4, del U5 ya he trabajado con el U575, con este perfil bajo STOP3</w:t>
+      </w:r>
+    </w:p>
+    <w:p>
+      <w:pPr>
+        <w:rPr>
+          <w:lang w:val="es-MX"/>
+        </w:rPr>
+      </w:pPr>
+      <w:r>
+        <w:rPr>
+          <w:lang w:val="es-MX"/>
+        </w:rPr>
+        <w:t>En STOP3 mode</w:t>
+      </w:r>
     </w:p>
     <w:p>
       <w:pPr>
@@ -310,21 +288,7 @@
         <w:rPr>
           <w:lang w:val="es-MX"/>
         </w:rPr>
-        <w:t xml:space="preserve">En STANDBY </w:t>
-      </w:r>
-      <w:proofErr w:type="spellStart"/>
-      <w:r>
-        <w:rPr>
-          <w:lang w:val="es-MX"/>
-        </w:rPr>
-        <w:t>Mode</w:t>
-      </w:r>
-      <w:proofErr w:type="spellEnd"/>
-      <w:r>
-        <w:rPr>
-          <w:lang w:val="es-MX"/>
-        </w:rPr>
-        <w:t>:</w:t>
+        <w:t>En STANDBY Mode:</w:t>
       </w:r>
     </w:p>
     <w:p>
@@ -498,91 +462,13 @@
         <w:rPr>
           <w:lang w:val="es-MX"/>
         </w:rPr>
-        <w:t xml:space="preserve">Elegí irme por el U575 porque la diferencia entre ambos en STANDBY es </w:t>
-      </w:r>
-      <w:proofErr w:type="spellStart"/>
-      <w:r>
-        <w:rPr>
-          <w:lang w:val="es-MX"/>
-        </w:rPr>
-        <w:t>minsucula</w:t>
-      </w:r>
-      <w:proofErr w:type="spellEnd"/>
-      <w:r>
-        <w:rPr>
-          <w:lang w:val="es-MX"/>
-        </w:rPr>
-        <w:t xml:space="preserve"> (21 vs 20 </w:t>
-      </w:r>
-      <w:proofErr w:type="spellStart"/>
-      <w:r>
-        <w:rPr>
-          <w:lang w:val="es-MX"/>
-        </w:rPr>
-        <w:t>microamps</w:t>
-      </w:r>
-      <w:proofErr w:type="spellEnd"/>
-      <w:r>
-        <w:rPr>
-          <w:lang w:val="es-MX"/>
-        </w:rPr>
-        <w:t xml:space="preserve">) y tengo </w:t>
-      </w:r>
-      <w:proofErr w:type="gramStart"/>
-      <w:r>
-        <w:rPr>
-          <w:lang w:val="es-MX"/>
-        </w:rPr>
-        <w:t>una núcleo</w:t>
-      </w:r>
-      <w:proofErr w:type="gramEnd"/>
-      <w:r>
-        <w:rPr>
-          <w:lang w:val="es-MX"/>
-        </w:rPr>
-        <w:t xml:space="preserve"> del U575 para prototipado; El cambio entre esos 2 modelos es muy sencillo de hacer en el </w:t>
-      </w:r>
-      <w:proofErr w:type="spellStart"/>
-      <w:r>
-        <w:rPr>
-          <w:lang w:val="es-MX"/>
-        </w:rPr>
-        <w:t>CubeMX</w:t>
-      </w:r>
-      <w:proofErr w:type="spellEnd"/>
-      <w:r>
-        <w:rPr>
-          <w:lang w:val="es-MX"/>
-        </w:rPr>
-        <w:t xml:space="preserve"> o con una macro que incluya el </w:t>
-      </w:r>
-      <w:proofErr w:type="spellStart"/>
-      <w:r>
-        <w:rPr>
-          <w:lang w:val="es-MX"/>
-        </w:rPr>
-        <w:t>hal</w:t>
-      </w:r>
-      <w:proofErr w:type="spellEnd"/>
-      <w:r>
-        <w:rPr>
-          <w:lang w:val="es-MX"/>
-        </w:rPr>
-        <w:t xml:space="preserve"> de uno u otro, </w:t>
-      </w:r>
-      <w:proofErr w:type="spellStart"/>
-      <w:r>
-        <w:rPr>
-          <w:lang w:val="es-MX"/>
-        </w:rPr>
-        <w:t>asi</w:t>
-      </w:r>
-      <w:proofErr w:type="spellEnd"/>
-      <w:r>
-        <w:rPr>
-          <w:lang w:val="es-MX"/>
-        </w:rPr>
-        <w:t xml:space="preserve"> que aquí me voy por la opción más fácil de testear.</w:t>
+        <w:t xml:space="preserve">Elegí irme por el U575 porque la diferencia entre ambos en STANDBY es minsucula (21 vs 20 microamps) y tengo una núcleo del U575 para prototipado; El cambio entre esos 2 modelos es muy sencillo de hacer en el CubeMX o con una macro que incluya el hal de uno u otro, </w:t>
+      </w:r>
+      <w:r>
+        <w:rPr>
+          <w:lang w:val="es-MX"/>
+        </w:rPr>
+        <w:t>asi que aquí me voy por la opción más fácil de testear.</w:t>
       </w:r>
     </w:p>
     <w:p>
@@ -639,69 +525,13 @@
         <w:rPr>
           <w:lang w:val="es-MX"/>
         </w:rPr>
-        <w:t xml:space="preserve">al no ocupar líneas </w:t>
-      </w:r>
-      <w:proofErr w:type="spellStart"/>
-      <w:r>
-        <w:rPr>
-          <w:lang w:val="es-MX"/>
-        </w:rPr>
-        <w:t>pull</w:t>
-      </w:r>
-      <w:proofErr w:type="spellEnd"/>
-      <w:r>
-        <w:rPr>
-          <w:lang w:val="es-MX"/>
-        </w:rPr>
-        <w:t xml:space="preserve">-up no hay </w:t>
-      </w:r>
-      <w:proofErr w:type="spellStart"/>
-      <w:r>
-        <w:rPr>
-          <w:lang w:val="es-MX"/>
-        </w:rPr>
-        <w:t>leakage</w:t>
-      </w:r>
-      <w:proofErr w:type="spellEnd"/>
-      <w:r>
-        <w:rPr>
-          <w:lang w:val="es-MX"/>
-        </w:rPr>
-        <w:t xml:space="preserve"> </w:t>
-      </w:r>
-      <w:proofErr w:type="spellStart"/>
-      <w:r>
-        <w:rPr>
-          <w:lang w:val="es-MX"/>
-        </w:rPr>
-        <w:t>current</w:t>
-      </w:r>
-      <w:proofErr w:type="spellEnd"/>
-      <w:r>
-        <w:rPr>
-          <w:lang w:val="es-MX"/>
-        </w:rPr>
-        <w:t xml:space="preserve"> (menor consumo de energía), las transmisiones son determinísticas, </w:t>
-      </w:r>
-      <w:r>
-        <w:rPr>
-          <w:lang w:val="es-MX"/>
-        </w:rPr>
-        <w:t xml:space="preserve">solo hay un </w:t>
-      </w:r>
-      <w:proofErr w:type="spellStart"/>
-      <w:r>
-        <w:rPr>
-          <w:lang w:val="es-MX"/>
-        </w:rPr>
-        <w:t>periferico</w:t>
-      </w:r>
-      <w:proofErr w:type="spellEnd"/>
-      <w:r>
-        <w:rPr>
-          <w:lang w:val="es-MX"/>
-        </w:rPr>
-        <w:t xml:space="preserve">, </w:t>
+        <w:t xml:space="preserve">al no ocupar líneas pull-up no hay leakage current (menor consumo de energía), las transmisiones son determinísticas, </w:t>
+      </w:r>
+      <w:r>
+        <w:rPr>
+          <w:lang w:val="es-MX"/>
+        </w:rPr>
+        <w:t xml:space="preserve">solo hay un periferico, </w:t>
       </w:r>
       <w:r>
         <w:rPr>
@@ -713,21 +543,7 @@
         <w:rPr>
           <w:lang w:val="es-MX"/>
         </w:rPr>
-        <w:t xml:space="preserve">el </w:t>
-      </w:r>
-      <w:proofErr w:type="spellStart"/>
-      <w:r>
-        <w:rPr>
-          <w:lang w:val="es-MX"/>
-        </w:rPr>
-        <w:t>numero</w:t>
-      </w:r>
-      <w:proofErr w:type="spellEnd"/>
-      <w:r>
-        <w:rPr>
-          <w:lang w:val="es-MX"/>
-        </w:rPr>
-        <w:t xml:space="preserve"> d</w:t>
+        <w:t>el numero d</w:t>
       </w:r>
       <w:r>
         <w:rPr>
@@ -747,19 +563,11 @@
         </w:rPr>
         <w:t xml:space="preserve"> no es un </w:t>
       </w:r>
-      <w:proofErr w:type="spellStart"/>
-      <w:r>
-        <w:rPr>
-          <w:lang w:val="es-MX"/>
-        </w:rPr>
-        <w:t>contraint</w:t>
-      </w:r>
-      <w:proofErr w:type="spellEnd"/>
-      <w:r>
-        <w:rPr>
-          <w:lang w:val="es-MX"/>
-        </w:rPr>
-        <w:t xml:space="preserve">. </w:t>
+      <w:r>
+        <w:rPr>
+          <w:lang w:val="es-MX"/>
+        </w:rPr>
+        <w:t xml:space="preserve">contraint. </w:t>
       </w:r>
     </w:p>
     <w:p>
@@ -786,69 +594,20 @@
         <w:rPr>
           <w:lang w:val="es-MX"/>
         </w:rPr>
-        <w:t xml:space="preserve"> con </w:t>
-      </w:r>
-      <w:proofErr w:type="spellStart"/>
-      <w:r>
-        <w:rPr>
-          <w:lang w:val="es-MX"/>
-        </w:rPr>
-        <w:t>el</w:t>
-      </w:r>
-      <w:proofErr w:type="spellEnd"/>
-      <w:r>
-        <w:rPr>
-          <w:lang w:val="es-MX"/>
-        </w:rPr>
-        <w:t xml:space="preserve">. </w:t>
-      </w:r>
-      <w:proofErr w:type="spellStart"/>
-      <w:r>
-        <w:t>Encontré</w:t>
-      </w:r>
-      <w:proofErr w:type="spellEnd"/>
-      <w:r>
-        <w:t xml:space="preserve"> </w:t>
-      </w:r>
-      <w:proofErr w:type="spellStart"/>
-      <w:r>
-        <w:t>e</w:t>
-      </w:r>
-      <w:r>
-        <w:t>ste</w:t>
-      </w:r>
-      <w:proofErr w:type="spellEnd"/>
-      <w:r>
-        <w:t xml:space="preserve"> </w:t>
-      </w:r>
-      <w:proofErr w:type="spellStart"/>
-      <w:r>
-        <w:t>recurso</w:t>
-      </w:r>
-      <w:proofErr w:type="spellEnd"/>
-      <w:r>
-        <w:t xml:space="preserve"> official: </w:t>
+        <w:t xml:space="preserve"> con el. </w:t>
+      </w:r>
+      <w:r>
+        <w:t>Encontré e</w:t>
+      </w:r>
+      <w:r>
+        <w:t xml:space="preserve">ste recurso official: </w:t>
       </w:r>
       <w:hyperlink r:id="rId11" w:history="1">
         <w:r>
           <w:rPr>
             <w:rStyle w:val="Hyperlink"/>
           </w:rPr>
-          <w:t>STMicroelectronics/</w:t>
-        </w:r>
-        <w:proofErr w:type="spellStart"/>
-        <w:r>
-          <w:rPr>
-            <w:rStyle w:val="Hyperlink"/>
-          </w:rPr>
-          <w:t>STMems_Standard_C_drivers</w:t>
-        </w:r>
-        <w:proofErr w:type="spellEnd"/>
-        <w:r>
-          <w:rPr>
-            <w:rStyle w:val="Hyperlink"/>
-          </w:rPr>
-          <w:t>: Platform-independent drivers for STMicroelectronics MEMS motion and environmental sensors, based on standard C programming language.</w:t>
+          <w:t>STMicroelectronics/STMems_Standard_C_drivers: Platform-independent drivers for STMicroelectronics MEMS motion and environmental sensors, based on standard C programming language.</w:t>
         </w:r>
       </w:hyperlink>
     </w:p>
@@ -868,55 +627,13 @@
         <w:rPr>
           <w:lang w:val="es-MX"/>
         </w:rPr>
-        <w:t xml:space="preserve">ste </w:t>
-      </w:r>
-      <w:proofErr w:type="spellStart"/>
-      <w:r>
-        <w:rPr>
-          <w:lang w:val="es-MX"/>
-        </w:rPr>
-        <w:t>git</w:t>
-      </w:r>
-      <w:proofErr w:type="spellEnd"/>
-      <w:r>
-        <w:rPr>
-          <w:lang w:val="es-MX"/>
-        </w:rPr>
-        <w:t xml:space="preserve"> </w:t>
-      </w:r>
-      <w:r>
-        <w:rPr>
-          <w:lang w:val="es-MX"/>
-        </w:rPr>
-        <w:t xml:space="preserve">repo (que usaremos como </w:t>
-      </w:r>
-      <w:proofErr w:type="spellStart"/>
-      <w:r>
-        <w:rPr>
-          <w:lang w:val="es-MX"/>
-        </w:rPr>
-        <w:t>git</w:t>
-      </w:r>
-      <w:proofErr w:type="spellEnd"/>
-      <w:r>
-        <w:rPr>
-          <w:lang w:val="es-MX"/>
-        </w:rPr>
-        <w:t xml:space="preserve"> </w:t>
-      </w:r>
-      <w:proofErr w:type="spellStart"/>
-      <w:r>
-        <w:rPr>
-          <w:lang w:val="es-MX"/>
-        </w:rPr>
-        <w:t>submodule</w:t>
-      </w:r>
-      <w:proofErr w:type="spellEnd"/>
-      <w:r>
-        <w:rPr>
-          <w:lang w:val="es-MX"/>
-        </w:rPr>
-        <w:t>)</w:t>
+        <w:t xml:space="preserve">ste git </w:t>
+      </w:r>
+      <w:r>
+        <w:rPr>
+          <w:lang w:val="es-MX"/>
+        </w:rPr>
+        <w:t>repo (que usaremos como git submodule)</w:t>
       </w:r>
       <w:r>
         <w:rPr>
@@ -937,13 +654,8 @@
     </w:p>
     <w:p>
       <w:r>
-        <w:t xml:space="preserve">Y </w:t>
-      </w:r>
-      <w:proofErr w:type="spellStart"/>
-      <w:r>
-        <w:t>este</w:t>
-      </w:r>
-      <w:proofErr w:type="spellEnd"/>
+        <w:t>Y este</w:t>
+      </w:r>
     </w:p>
     <w:p>
       <w:pPr>
@@ -985,42 +697,20 @@
         <w:rPr>
           <w:lang w:val="es-MX"/>
         </w:rPr>
-        <w:t xml:space="preserve">Configurando el </w:t>
-      </w:r>
-      <w:proofErr w:type="spellStart"/>
-      <w:r>
-        <w:rPr>
-          <w:lang w:val="es-MX"/>
-        </w:rPr>
-        <w:t>periferico</w:t>
-      </w:r>
-      <w:proofErr w:type="spellEnd"/>
-      <w:r>
-        <w:rPr>
-          <w:lang w:val="es-MX"/>
-        </w:rPr>
-        <w:t xml:space="preserve"> SPI en STM:</w:t>
-      </w:r>
-    </w:p>
-    <w:p>
-      <w:pPr>
-        <w:rPr>
-          <w:lang w:val="es-MX"/>
-        </w:rPr>
-      </w:pPr>
-      <w:proofErr w:type="spellStart"/>
-      <w:r>
-        <w:rPr>
-          <w:lang w:val="es-MX"/>
-        </w:rPr>
-        <w:t>Basandonos</w:t>
-      </w:r>
-      <w:proofErr w:type="spellEnd"/>
-      <w:r>
-        <w:rPr>
-          <w:lang w:val="es-MX"/>
-        </w:rPr>
-        <w:t xml:space="preserve"> en la datasheet del lis2dw12:</w:t>
+        <w:t>Configurando el periferico SPI en STM:</w:t>
+      </w:r>
+    </w:p>
+    <w:p>
+      <w:pPr>
+        <w:rPr>
+          <w:lang w:val="es-MX"/>
+        </w:rPr>
+      </w:pPr>
+      <w:r>
+        <w:rPr>
+          <w:lang w:val="es-MX"/>
+        </w:rPr>
+        <w:t>Basandonos en la datasheet del lis2dw12:</w:t>
       </w:r>
     </w:p>
     <w:p>
@@ -1081,55 +771,13 @@
         <w:rPr>
           <w:lang w:val="es-MX"/>
         </w:rPr>
-        <w:t xml:space="preserve">Aquí obtenemos la velocidad máxima del </w:t>
-      </w:r>
-      <w:proofErr w:type="spellStart"/>
-      <w:r>
-        <w:rPr>
-          <w:lang w:val="es-MX"/>
-        </w:rPr>
-        <w:t>clock</w:t>
-      </w:r>
-      <w:proofErr w:type="spellEnd"/>
-      <w:r>
-        <w:rPr>
-          <w:lang w:val="es-MX"/>
-        </w:rPr>
-        <w:t>, que sería 10MHz</w:t>
-      </w:r>
-      <w:r>
-        <w:rPr>
-          <w:lang w:val="es-MX"/>
-        </w:rPr>
-        <w:t xml:space="preserve">, así como el </w:t>
-      </w:r>
-      <w:proofErr w:type="spellStart"/>
-      <w:r>
-        <w:rPr>
-          <w:lang w:val="es-MX"/>
-        </w:rPr>
-        <w:t>setup</w:t>
-      </w:r>
-      <w:proofErr w:type="spellEnd"/>
-      <w:r>
-        <w:rPr>
-          <w:lang w:val="es-MX"/>
-        </w:rPr>
-        <w:t xml:space="preserve"> time del Chip </w:t>
-      </w:r>
-      <w:proofErr w:type="spellStart"/>
-      <w:r>
-        <w:rPr>
-          <w:lang w:val="es-MX"/>
-        </w:rPr>
-        <w:t>Select</w:t>
-      </w:r>
-      <w:proofErr w:type="spellEnd"/>
-      <w:r>
-        <w:rPr>
-          <w:lang w:val="es-MX"/>
-        </w:rPr>
-        <w:t>.</w:t>
+        <w:t>Aquí obtenemos la velocidad máxima del clock, que sería 10MHz</w:t>
+      </w:r>
+      <w:r>
+        <w:rPr>
+          <w:lang w:val="es-MX"/>
+        </w:rPr>
+        <w:t>, así como el setup time del Chip Select.</w:t>
       </w:r>
     </w:p>
     <w:p>
@@ -1197,117 +845,33 @@
         <w:rPr>
           <w:lang w:val="es-MX"/>
         </w:rPr>
-        <w:t xml:space="preserve">Aquí se explica que CS en </w:t>
-      </w:r>
-      <w:proofErr w:type="spellStart"/>
-      <w:r>
-        <w:rPr>
-          <w:lang w:val="es-MX"/>
-        </w:rPr>
-        <w:t>low</w:t>
-      </w:r>
-      <w:proofErr w:type="spellEnd"/>
-      <w:r>
-        <w:rPr>
-          <w:lang w:val="es-MX"/>
-        </w:rPr>
-        <w:t xml:space="preserve"> empieza la transmisión, y que se </w:t>
-      </w:r>
-      <w:proofErr w:type="spellStart"/>
-      <w:r>
-        <w:rPr>
-          <w:lang w:val="es-MX"/>
-        </w:rPr>
-        <w:t>peuden</w:t>
-      </w:r>
-      <w:proofErr w:type="spellEnd"/>
-      <w:r>
-        <w:rPr>
-          <w:lang w:val="es-MX"/>
-        </w:rPr>
-        <w:t xml:space="preserve"> tener múltiplos de 8 bits para los paquetes de data; se puede inferir que es MSB porque el bit 8-15 empieza en DI7, y que el modo del CPOL 0 (</w:t>
-      </w:r>
-      <w:proofErr w:type="spellStart"/>
-      <w:r>
-        <w:rPr>
-          <w:lang w:val="es-MX"/>
-        </w:rPr>
-        <w:t>falling</w:t>
-      </w:r>
-      <w:proofErr w:type="spellEnd"/>
-      <w:r>
-        <w:rPr>
-          <w:lang w:val="es-MX"/>
-        </w:rPr>
-        <w:t xml:space="preserve"> </w:t>
-      </w:r>
-      <w:proofErr w:type="spellStart"/>
-      <w:r>
-        <w:rPr>
-          <w:lang w:val="es-MX"/>
-        </w:rPr>
-        <w:t>edge</w:t>
-      </w:r>
-      <w:proofErr w:type="spellEnd"/>
-      <w:r>
-        <w:rPr>
-          <w:lang w:val="es-MX"/>
-        </w:rPr>
-        <w:t>) y CPHA es</w:t>
-      </w:r>
-      <w:r>
-        <w:rPr>
-          <w:lang w:val="es-MX"/>
-        </w:rPr>
-        <w:t xml:space="preserve"> 0 (1 </w:t>
-      </w:r>
-      <w:proofErr w:type="spellStart"/>
-      <w:r>
-        <w:rPr>
-          <w:lang w:val="es-MX"/>
-        </w:rPr>
-        <w:t>edge</w:t>
-      </w:r>
-      <w:proofErr w:type="spellEnd"/>
-      <w:r>
-        <w:rPr>
-          <w:lang w:val="es-MX"/>
-        </w:rPr>
-        <w:t>).</w:t>
-      </w:r>
-    </w:p>
-    <w:p>
-      <w:pPr>
-        <w:rPr>
-          <w:lang w:val="es-MX"/>
-        </w:rPr>
-      </w:pPr>
-    </w:p>
-    <w:p>
-      <w:pPr>
-        <w:rPr>
-          <w:lang w:val="es-MX"/>
-        </w:rPr>
-      </w:pPr>
-      <w:r>
-        <w:rPr>
-          <w:lang w:val="es-MX"/>
-        </w:rPr>
-        <w:t xml:space="preserve">Ahora generamos el SPI desde </w:t>
-      </w:r>
-      <w:proofErr w:type="spellStart"/>
-      <w:r>
-        <w:rPr>
-          <w:lang w:val="es-MX"/>
-        </w:rPr>
-        <w:t>cubeMX</w:t>
-      </w:r>
-      <w:proofErr w:type="spellEnd"/>
-      <w:r>
-        <w:rPr>
-          <w:lang w:val="es-MX"/>
-        </w:rPr>
-        <w:t xml:space="preserve"> con esos parámetros:</w:t>
+        <w:t>Aquí se explica que CS en low empieza la transmisión, y que se peuden tener múltiplos de 8 bits para los paquetes de data; se puede inferir que es MSB porque el bit 8-15 empieza en DI7, y que el modo del CPOL 0 (falling edge) y CPHA es</w:t>
+      </w:r>
+      <w:r>
+        <w:rPr>
+          <w:lang w:val="es-MX"/>
+        </w:rPr>
+        <w:t xml:space="preserve"> 0 (1 edge).</w:t>
+      </w:r>
+    </w:p>
+    <w:p>
+      <w:pPr>
+        <w:rPr>
+          <w:lang w:val="es-MX"/>
+        </w:rPr>
+      </w:pPr>
+    </w:p>
+    <w:p>
+      <w:pPr>
+        <w:rPr>
+          <w:lang w:val="es-MX"/>
+        </w:rPr>
+      </w:pPr>
+      <w:r>
+        <w:rPr>
+          <w:lang w:val="es-MX"/>
+        </w:rPr>
+        <w:t>Ahora generamos el SPI desde cubeMX con esos parámetros:</w:t>
       </w:r>
     </w:p>
     <w:p>
@@ -1369,21 +933,68 @@
         <w:rPr>
           <w:lang w:val="es-MX"/>
         </w:rPr>
-        <w:t xml:space="preserve">Se habilita el control de NSS (CS) por hardware para que sea más preciso el timing del CS, eliminando error humano por software que pueda consumir </w:t>
-      </w:r>
-      <w:proofErr w:type="spellStart"/>
-      <w:r>
-        <w:rPr>
-          <w:lang w:val="es-MX"/>
-        </w:rPr>
-        <w:t>mas</w:t>
-      </w:r>
-      <w:proofErr w:type="spellEnd"/>
-      <w:r>
-        <w:rPr>
-          <w:lang w:val="es-MX"/>
-        </w:rPr>
-        <w:t xml:space="preserve"> corriente.</w:t>
+        <w:t>*Nota: Se cambió a LSB porque la librería importada esta configurada por default así, y el modo MSB esta buggeado en la master Branch del submodulo (aunque lo arreglé en local)</w:t>
+      </w:r>
+    </w:p>
+    <w:p>
+      <w:pPr>
+        <w:rPr>
+          <w:lang w:val="es-MX"/>
+        </w:rPr>
+      </w:pPr>
+      <w:r>
+        <w:rPr>
+          <w:lang w:val="es-MX"/>
+        </w:rPr>
+        <w:lastRenderedPageBreak/>
+        <w:drawing>
+          <wp:inline distT="0" distB="0" distL="0" distR="0" wp14:anchorId="42425E5F" wp14:editId="3FB05484">
+            <wp:extent cx="5943600" cy="1959610"/>
+            <wp:effectExtent l="0" t="0" r="0" b="2540"/>
+            <wp:docPr id="576341885" name="Picture 1"/>
+            <wp:cNvGraphicFramePr>
+              <a:graphicFrameLocks xmlns:a="http://schemas.openxmlformats.org/drawingml/2006/main" noChangeAspect="1"/>
+            </wp:cNvGraphicFramePr>
+            <a:graphic xmlns:a="http://schemas.openxmlformats.org/drawingml/2006/main">
+              <a:graphicData uri="http://schemas.openxmlformats.org/drawingml/2006/picture">
+                <pic:pic xmlns:pic="http://schemas.openxmlformats.org/drawingml/2006/picture">
+                  <pic:nvPicPr>
+                    <pic:cNvPr id="576341885" name=""/>
+                    <pic:cNvPicPr/>
+                  </pic:nvPicPr>
+                  <pic:blipFill>
+                    <a:blip r:embed="rId17"/>
+                    <a:stretch>
+                      <a:fillRect/>
+                    </a:stretch>
+                  </pic:blipFill>
+                  <pic:spPr>
+                    <a:xfrm>
+                      <a:off x="0" y="0"/>
+                      <a:ext cx="5943600" cy="1959610"/>
+                    </a:xfrm>
+                    <a:prstGeom prst="rect">
+                      <a:avLst/>
+                    </a:prstGeom>
+                  </pic:spPr>
+                </pic:pic>
+              </a:graphicData>
+            </a:graphic>
+          </wp:inline>
+        </w:drawing>
+      </w:r>
+    </w:p>
+    <w:p>
+      <w:pPr>
+        <w:rPr>
+          <w:lang w:val="es-MX"/>
+        </w:rPr>
+      </w:pPr>
+      <w:r>
+        <w:rPr>
+          <w:lang w:val="es-MX"/>
+        </w:rPr>
+        <w:t>Se habilita el control de NSS (CS) por hardware para que sea más preciso el timing del CS, eliminando error humano por software que pueda consumir mas corriente.</w:t>
       </w:r>
     </w:p>
     <w:p>
@@ -1397,7 +1008,6 @@
           <w:noProof/>
           <w:lang w:val="es-MX"/>
         </w:rPr>
-        <w:lastRenderedPageBreak/>
         <w:drawing>
           <wp:inline distT="0" distB="0" distL="0" distR="0" wp14:anchorId="5D293B35" wp14:editId="785FECEE">
             <wp:extent cx="5943600" cy="1017270"/>
@@ -1414,7 +1024,7 @@
                     <pic:cNvPicPr/>
                   </pic:nvPicPr>
                   <pic:blipFill>
-                    <a:blip r:embed="rId17"/>
+                    <a:blip r:embed="rId18"/>
                     <a:stretch>
                       <a:fillRect/>
                     </a:stretch>
@@ -1472,86 +1082,8 @@
         <w:rPr>
           <w:lang w:val="es-MX"/>
         </w:rPr>
-        <w:t xml:space="preserve">Set </w:t>
-      </w:r>
-      <w:proofErr w:type="spellStart"/>
-      <w:r>
-        <w:rPr>
-          <w:lang w:val="es-MX"/>
-        </w:rPr>
-        <w:t>all</w:t>
-      </w:r>
-      <w:proofErr w:type="spellEnd"/>
-      <w:r>
-        <w:rPr>
-          <w:lang w:val="es-MX"/>
-        </w:rPr>
-        <w:t xml:space="preserve"> free </w:t>
-      </w:r>
-      <w:proofErr w:type="spellStart"/>
-      <w:r>
-        <w:rPr>
-          <w:lang w:val="es-MX"/>
-        </w:rPr>
-        <w:t>pins</w:t>
-      </w:r>
-      <w:proofErr w:type="spellEnd"/>
-      <w:r>
-        <w:rPr>
-          <w:lang w:val="es-MX"/>
-        </w:rPr>
-        <w:t xml:space="preserve"> as </w:t>
-      </w:r>
-      <w:proofErr w:type="spellStart"/>
-      <w:r>
-        <w:rPr>
-          <w:lang w:val="es-MX"/>
-        </w:rPr>
-        <w:t>analog</w:t>
-      </w:r>
-      <w:proofErr w:type="spellEnd"/>
-      <w:r>
-        <w:rPr>
-          <w:lang w:val="es-MX"/>
-        </w:rPr>
-        <w:t xml:space="preserve"> </w:t>
-      </w:r>
-      <w:proofErr w:type="spellStart"/>
-      <w:r>
-        <w:rPr>
-          <w:lang w:val="es-MX"/>
-        </w:rPr>
-        <w:t>to</w:t>
-      </w:r>
-      <w:proofErr w:type="spellEnd"/>
-      <w:r>
-        <w:rPr>
-          <w:lang w:val="es-MX"/>
-        </w:rPr>
-        <w:t xml:space="preserve"> reduce </w:t>
-      </w:r>
-      <w:proofErr w:type="spellStart"/>
-      <w:r>
-        <w:rPr>
-          <w:lang w:val="es-MX"/>
-        </w:rPr>
-        <w:t>power</w:t>
-      </w:r>
-      <w:proofErr w:type="spellEnd"/>
-      <w:r>
-        <w:rPr>
-          <w:lang w:val="es-MX"/>
-        </w:rPr>
-        <w:t xml:space="preserve"> </w:t>
-      </w:r>
-      <w:proofErr w:type="spellStart"/>
-      <w:r>
-        <w:rPr>
-          <w:lang w:val="es-MX"/>
-        </w:rPr>
-        <w:t>consumption</w:t>
-      </w:r>
-      <w:proofErr w:type="spellEnd"/>
+        <w:t>Set all free pins as analog to reduce power consumption</w:t>
+      </w:r>
       <w:r>
         <w:rPr>
           <w:lang w:val="es-MX"/>
@@ -1586,7 +1118,7 @@
                     <pic:cNvPicPr/>
                   </pic:nvPicPr>
                   <pic:blipFill>
-                    <a:blip r:embed="rId18"/>
+                    <a:blip r:embed="rId19"/>
                     <a:stretch>
                       <a:fillRect/>
                     </a:stretch>
@@ -1650,6 +1182,7 @@
           <w:noProof/>
           <w:lang w:val="es-MX"/>
         </w:rPr>
+        <w:lastRenderedPageBreak/>
         <w:drawing>
           <wp:inline distT="0" distB="0" distL="0" distR="0" wp14:anchorId="1673F066" wp14:editId="5A6D04B3">
             <wp:extent cx="5943600" cy="1446530"/>
@@ -1666,7 +1199,7 @@
                     <pic:cNvPicPr/>
                   </pic:nvPicPr>
                   <pic:blipFill>
-                    <a:blip r:embed="rId19"/>
+                    <a:blip r:embed="rId20"/>
                     <a:stretch>
                       <a:fillRect/>
                     </a:stretch>
@@ -1705,35 +1238,7 @@
         <w:rPr>
           <w:lang w:val="es-MX"/>
         </w:rPr>
-        <w:t xml:space="preserve"> Se recomienda </w:t>
-      </w:r>
-      <w:proofErr w:type="spellStart"/>
-      <w:r>
-        <w:rPr>
-          <w:lang w:val="es-MX"/>
-        </w:rPr>
-        <w:t>setear</w:t>
-      </w:r>
-      <w:proofErr w:type="spellEnd"/>
-      <w:r>
-        <w:rPr>
-          <w:lang w:val="es-MX"/>
-        </w:rPr>
-        <w:t xml:space="preserve"> SMPS para tener el menor consumo de corriente; En este ejercicio no se </w:t>
-      </w:r>
-      <w:proofErr w:type="spellStart"/>
-      <w:r>
-        <w:rPr>
-          <w:lang w:val="es-MX"/>
-        </w:rPr>
-        <w:t>setea</w:t>
-      </w:r>
-      <w:proofErr w:type="spellEnd"/>
-      <w:r>
-        <w:rPr>
-          <w:lang w:val="es-MX"/>
-        </w:rPr>
-        <w:t xml:space="preserve"> debido a que depende de hardware</w:t>
+        <w:t xml:space="preserve"> Se recomienda setear SMPS para tener el menor consumo de corriente; En este ejercicio no se setea debido a que depende de hardware</w:t>
       </w:r>
       <w:r>
         <w:rPr>
@@ -1775,6 +1280,7 @@
       </w:pPr>
       <w:r>
         <w:rPr>
+          <w:noProof/>
           <w:lang w:val="es-MX"/>
         </w:rPr>
         <w:lastRenderedPageBreak/>
@@ -1794,7 +1300,7 @@
                     <pic:cNvPicPr/>
                   </pic:nvPicPr>
                   <pic:blipFill>
-                    <a:blip r:embed="rId20"/>
+                    <a:blip r:embed="rId21"/>
                     <a:stretch>
                       <a:fillRect/>
                     </a:stretch>
@@ -1843,7 +1349,6 @@
           <w:lang w:val="es-MX"/>
         </w:rPr>
       </w:pPr>
-      <w:proofErr w:type="spellStart"/>
       <w:r>
         <w:rPr>
           <w:lang w:val="es-MX"/>
@@ -1857,7 +1362,6 @@
         </w:rPr>
         <w:t>r</w:t>
       </w:r>
-      <w:proofErr w:type="spellEnd"/>
       <w:r>
         <w:rPr>
           <w:lang w:val="es-MX"/>
@@ -1892,7 +1396,7 @@
                     <pic:cNvPicPr/>
                   </pic:nvPicPr>
                   <pic:blipFill>
-                    <a:blip r:embed="rId21"/>
+                    <a:blip r:embed="rId22"/>
                     <a:stretch>
                       <a:fillRect/>
                     </a:stretch>
@@ -1929,70 +1433,20 @@
         <w:rPr>
           <w:lang w:val="es-MX"/>
         </w:rPr>
-        <w:t xml:space="preserve">Open </w:t>
-      </w:r>
-      <w:proofErr w:type="spellStart"/>
-      <w:r>
-        <w:rPr>
-          <w:lang w:val="es-MX"/>
-        </w:rPr>
-        <w:t>projects</w:t>
-      </w:r>
-      <w:proofErr w:type="spellEnd"/>
-      <w:r>
-        <w:rPr>
-          <w:lang w:val="es-MX"/>
-        </w:rPr>
-        <w:t xml:space="preserve"> </w:t>
-      </w:r>
-      <w:proofErr w:type="spellStart"/>
-      <w:r>
-        <w:rPr>
-          <w:lang w:val="es-MX"/>
-        </w:rPr>
-        <w:t>from</w:t>
-      </w:r>
-      <w:proofErr w:type="spellEnd"/>
-      <w:r>
-        <w:rPr>
-          <w:lang w:val="es-MX"/>
-        </w:rPr>
-        <w:t xml:space="preserve"> file </w:t>
-      </w:r>
-      <w:proofErr w:type="spellStart"/>
-      <w:r>
-        <w:rPr>
-          <w:lang w:val="es-MX"/>
-        </w:rPr>
-        <w:t>system</w:t>
-      </w:r>
-      <w:proofErr w:type="spellEnd"/>
-    </w:p>
-    <w:p>
-      <w:pPr>
-        <w:rPr>
-          <w:lang w:val="es-MX"/>
-        </w:rPr>
-      </w:pPr>
-      <w:r>
-        <w:rPr>
-          <w:lang w:val="es-MX"/>
-        </w:rPr>
-        <w:t xml:space="preserve">Seleccionar el directorio donde se generó el </w:t>
-      </w:r>
-      <w:proofErr w:type="spellStart"/>
-      <w:r>
-        <w:rPr>
-          <w:lang w:val="es-MX"/>
-        </w:rPr>
-        <w:t>proeycto</w:t>
-      </w:r>
-      <w:proofErr w:type="spellEnd"/>
-      <w:r>
-        <w:rPr>
-          <w:lang w:val="es-MX"/>
-        </w:rPr>
-        <w:t xml:space="preserve"> con STM32CubeMX</w:t>
+        <w:t>Open projects from file system</w:t>
+      </w:r>
+    </w:p>
+    <w:p>
+      <w:pPr>
+        <w:rPr>
+          <w:lang w:val="es-MX"/>
+        </w:rPr>
+      </w:pPr>
+      <w:r>
+        <w:rPr>
+          <w:lang w:val="es-MX"/>
+        </w:rPr>
+        <w:t>Seleccionar el directorio donde se generó el proeycto con STM32CubeMX</w:t>
       </w:r>
     </w:p>
     <w:p>
@@ -2023,7 +1477,7 @@
                     <pic:cNvPicPr/>
                   </pic:nvPicPr>
                   <pic:blipFill>
-                    <a:blip r:embed="rId22"/>
+                    <a:blip r:embed="rId23"/>
                     <a:stretch>
                       <a:fillRect/>
                     </a:stretch>
@@ -2084,7 +1538,7 @@
                     <pic:cNvPicPr/>
                   </pic:nvPicPr>
                   <pic:blipFill>
-                    <a:blip r:embed="rId23"/>
+                    <a:blip r:embed="rId24"/>
                     <a:stretch>
                       <a:fillRect/>
                     </a:stretch>
@@ -2115,35 +1569,7 @@
         <w:rPr>
           <w:lang w:val="es-MX"/>
         </w:rPr>
-        <w:t xml:space="preserve">Y estas las agregué en el </w:t>
-      </w:r>
-      <w:proofErr w:type="spellStart"/>
-      <w:r>
-        <w:rPr>
-          <w:lang w:val="es-MX"/>
-        </w:rPr>
-        <w:t>path</w:t>
-      </w:r>
-      <w:proofErr w:type="spellEnd"/>
-      <w:r>
-        <w:rPr>
-          <w:lang w:val="es-MX"/>
-        </w:rPr>
-        <w:t xml:space="preserve"> de </w:t>
-      </w:r>
-      <w:proofErr w:type="spellStart"/>
-      <w:r>
-        <w:rPr>
-          <w:lang w:val="es-MX"/>
-        </w:rPr>
-        <w:t>sources</w:t>
-      </w:r>
-      <w:proofErr w:type="spellEnd"/>
-      <w:r>
-        <w:rPr>
-          <w:lang w:val="es-MX"/>
-        </w:rPr>
-        <w:t>:</w:t>
+        <w:t>Y estas las agregué en el path de sources:</w:t>
       </w:r>
     </w:p>
     <w:p>
@@ -2174,7 +1600,7 @@
                     <pic:cNvPicPr/>
                   </pic:nvPicPr>
                   <pic:blipFill>
-                    <a:blip r:embed="rId24"/>
+                    <a:blip r:embed="rId25"/>
                     <a:stretch>
                       <a:fillRect/>
                     </a:stretch>
@@ -2222,7 +1648,7 @@
                     <pic:cNvPicPr/>
                   </pic:nvPicPr>
                   <pic:blipFill>
-                    <a:blip r:embed="rId25"/>
+                    <a:blip r:embed="rId26"/>
                     <a:stretch>
                       <a:fillRect/>
                     </a:stretch>
@@ -2283,48 +1709,20 @@
           <w:lang w:val="es-MX"/>
         </w:rPr>
         <w:lastRenderedPageBreak/>
-        <w:t xml:space="preserve">Firmware para Deep </w:t>
-      </w:r>
-      <w:proofErr w:type="spellStart"/>
-      <w:r>
-        <w:rPr>
-          <w:lang w:val="es-MX"/>
-        </w:rPr>
-        <w:t>sleep</w:t>
-      </w:r>
-      <w:proofErr w:type="spellEnd"/>
-      <w:r>
-        <w:rPr>
-          <w:lang w:val="es-MX"/>
-        </w:rPr>
-        <w:t>:</w:t>
-      </w:r>
-    </w:p>
-    <w:p>
-      <w:pPr>
-        <w:rPr>
-          <w:lang w:val="es-MX"/>
-        </w:rPr>
-      </w:pPr>
-      <w:r>
-        <w:rPr>
-          <w:lang w:val="es-MX"/>
-        </w:rPr>
-        <w:t xml:space="preserve">Deep </w:t>
-      </w:r>
-      <w:proofErr w:type="spellStart"/>
-      <w:r>
-        <w:rPr>
-          <w:lang w:val="es-MX"/>
-        </w:rPr>
-        <w:t>sleep</w:t>
-      </w:r>
-      <w:proofErr w:type="spellEnd"/>
-      <w:r>
-        <w:rPr>
-          <w:lang w:val="es-MX"/>
-        </w:rPr>
-        <w:t xml:space="preserve"> basado en AN5652</w:t>
+        <w:t>Firmware para Deep sleep:</w:t>
+      </w:r>
+    </w:p>
+    <w:p>
+      <w:pPr>
+        <w:rPr>
+          <w:lang w:val="es-MX"/>
+        </w:rPr>
+      </w:pPr>
+      <w:r>
+        <w:rPr>
+          <w:lang w:val="es-MX"/>
+        </w:rPr>
+        <w:t>Deep sleep basado en AN5652</w:t>
       </w:r>
       <w:r>
         <w:rPr>
@@ -2334,6 +1732,7 @@
       </w:r>
       <w:r>
         <w:rPr>
+          <w:noProof/>
           <w:lang w:val="es-MX"/>
         </w:rPr>
         <w:drawing>
@@ -2352,7 +1751,7 @@
                     <pic:cNvPicPr/>
                   </pic:nvPicPr>
                   <pic:blipFill>
-                    <a:blip r:embed="rId26"/>
+                    <a:blip r:embed="rId27"/>
                     <a:stretch>
                       <a:fillRect/>
                     </a:stretch>

</xml_diff>